<commit_message>
last update of review lab1
</commit_message>
<xml_diff>
--- a/lab1/лр1.docx
+++ b/lab1/лр1.docx
@@ -46,25 +46,7 @@
         <w:jc w:val="center"/>
       </w:pPr>
       <w:r>
-        <w:t>по</w:t>
-      </w:r>
-      <w:r>
-        <w:t xml:space="preserve"> </w:t>
-      </w:r>
-      <w:r>
-        <w:t>лабораторной работе №</w:t>
-      </w:r>
-      <w:r>
-        <w:t>1</w:t>
-      </w:r>
-      <w:r>
-        <w:t xml:space="preserve"> по предмету «</w:t>
-      </w:r>
-      <w:r>
-        <w:t>КГ</w:t>
-      </w:r>
-      <w:r>
-        <w:t>»</w:t>
+        <w:t>по лабораторной работе №1 по предмету «КГ»</w:t>
       </w:r>
     </w:p>
     <w:p>
@@ -181,13 +163,7 @@
         <w:jc w:val="left"/>
       </w:pPr>
       <w:r>
-        <w:t>Камыно</w:t>
-      </w:r>
-      <w:r>
-        <w:t xml:space="preserve"> </w:t>
-      </w:r>
-      <w:r>
-        <w:t>Максима Александровича</w:t>
+        <w:t>Камыно Максима Александровича</w:t>
       </w:r>
     </w:p>
     <w:p>
@@ -206,25 +182,7 @@
         <w:rPr>
           <w:color w:val="000000" w:themeColor="text1"/>
         </w:rPr>
-        <w:t xml:space="preserve">студента </w:t>
-      </w:r>
-      <w:r>
-        <w:rPr>
-          <w:color w:val="000000" w:themeColor="text1"/>
-        </w:rPr>
-        <w:t>3</w:t>
-      </w:r>
-      <w:r>
-        <w:rPr>
-          <w:color w:val="000000" w:themeColor="text1"/>
-        </w:rPr>
-        <w:t xml:space="preserve"> курса</w:t>
-      </w:r>
-      <w:r>
-        <w:rPr>
-          <w:color w:val="000000" w:themeColor="text1"/>
-        </w:rPr>
-        <w:t>,</w:t>
+        <w:t>студента 3 курса,</w:t>
       </w:r>
       <w:r>
         <w:rPr>
@@ -233,10 +191,7 @@
         <w:t xml:space="preserve"> </w:t>
       </w:r>
       <w:r>
-        <w:t>3</w:t>
-      </w:r>
-      <w:r>
-        <w:t xml:space="preserve"> группы</w:t>
+        <w:t>3 группы</w:t>
       </w:r>
     </w:p>
     <w:p>
@@ -253,13 +208,7 @@
         <w:t xml:space="preserve">специальность </w:t>
       </w:r>
       <w:r>
-        <w:t>«</w:t>
-      </w:r>
-      <w:r>
-        <w:t>Информатика</w:t>
-      </w:r>
-      <w:r>
-        <w:t>»</w:t>
+        <w:t>«Информатика»</w:t>
       </w:r>
     </w:p>
     <w:p>
@@ -458,13 +407,7 @@
         </w:numPr>
       </w:pPr>
       <w:r>
-        <w:t>Изучить принципы построения</w:t>
-      </w:r>
-      <w:r>
-        <w:t xml:space="preserve"> </w:t>
-      </w:r>
-      <w:r>
-        <w:t>и диапазоны значений моделей RGB, CMYK и HLS.</w:t>
+        <w:t>Изучить принципы построения и диапазоны значений моделей RGB, CMYK и HLS.</w:t>
       </w:r>
     </w:p>
     <w:p>
@@ -475,10 +418,7 @@
         </w:numPr>
       </w:pPr>
       <w:r>
-        <w:t>Изучить формулы прямых и обратных преобразований между моделями, включая особые случаи</w:t>
-      </w:r>
-      <w:r>
-        <w:t>.</w:t>
+        <w:t>Изучить формулы прямых и обратных преобразований между моделями, включая особые случаи.</w:t>
       </w:r>
     </w:p>
     <w:p>
@@ -542,10 +482,10 @@
           <w:noProof/>
         </w:rPr>
         <w:drawing>
-          <wp:inline distT="0" distB="0" distL="0" distR="0" wp14:anchorId="3E5C9B14" wp14:editId="60B6DF66">
+          <wp:inline distT="0" distB="0" distL="0" distR="0" wp14:anchorId="7EB346CC" wp14:editId="3EAFED6E">
             <wp:extent cx="4632960" cy="3912876"/>
             <wp:effectExtent l="0" t="0" r="0" b="0"/>
-            <wp:docPr id="1" name="Рисунок 1" descr="Изображение выглядит как текст, снимок экрана, программное обеспечение, число&#10;&#10;Контент, сгенерированный ИИ, может содержать ошибки."/>
+            <wp:docPr id="1" name="Рисунок 1" descr="Изображение выглядит как текст, снимок экрана, программное обеспечение, число  Контент, сгенерированный ИИ, может содержать ошибки."/>
             <wp:cNvGraphicFramePr>
               <a:graphicFrameLocks xmlns:a="http://schemas.openxmlformats.org/drawingml/2006/main" noChangeAspect="1"/>
             </wp:cNvGraphicFramePr>
@@ -553,7 +493,7 @@
               <a:graphicData uri="http://schemas.openxmlformats.org/drawingml/2006/picture">
                 <pic:pic xmlns:pic="http://schemas.openxmlformats.org/drawingml/2006/picture">
                   <pic:nvPicPr>
-                    <pic:cNvPr id="1" name="Рисунок 1" descr="Изображение выглядит как текст, снимок экрана, программное обеспечение, число&#10;&#10;Контент, сгенерированный ИИ, может содержать ошибки."/>
+                    <pic:cNvPr id="1" name="Рисунок 1" descr="Изображение выглядит как текст, снимок экрана, программное обеспечение, число  Контент, сгенерированный ИИ, может содержать ошибки."/>
                     <pic:cNvPicPr/>
                   </pic:nvPicPr>
                   <pic:blipFill>
@@ -603,55 +543,7 @@
     </w:p>
     <w:p>
       <w:r>
-        <w:t xml:space="preserve">Преобразования реализованы тремя классами: RGBModel, CMYKModel и HLSModel. Прямых формул между CMYK и HLS нет, поэтому эти пары считаются через RGB (CMYK </w:t>
-      </w:r>
-      <w:r>
-        <w:t>-&gt;</w:t>
-      </w:r>
-      <w:r>
-        <w:t xml:space="preserve"> RGB </w:t>
-      </w:r>
-      <w:r>
-        <w:t>-&gt;</w:t>
-      </w:r>
-      <w:r>
-        <w:t xml:space="preserve"> HLS и HLS </w:t>
-      </w:r>
-      <w:r>
-        <w:t>-&gt;</w:t>
-      </w:r>
-      <w:r>
-        <w:t xml:space="preserve"> RGB </w:t>
-      </w:r>
-      <w:r>
-        <w:t>-&gt;</w:t>
-      </w:r>
-      <w:r>
-        <w:t xml:space="preserve"> CMYK).</w:t>
-      </w:r>
-      <w:r>
-        <w:t xml:space="preserve"> </w:t>
-      </w:r>
-      <w:r>
-        <w:t xml:space="preserve">Преобразования RGB </w:t>
-      </w:r>
-      <w:r>
-        <w:t>-&gt;</w:t>
-      </w:r>
-      <w:r>
-        <w:t xml:space="preserve"> CMYK и CMYK </w:t>
-      </w:r>
-      <w:r>
-        <w:t>-&gt;</w:t>
-      </w:r>
-      <w:r>
-        <w:t xml:space="preserve"> RGB показаны на рисунке 2. В RGB </w:t>
-      </w:r>
-      <w:r>
-        <w:t>-&gt;</w:t>
-      </w:r>
-      <w:r>
-        <w:t xml:space="preserve"> CMYK для чёрного цвета (K = 1) знаменатель 1 − K равен нулю, поэтому этот случай обработан отдельно: возвращается C = M = Y = 0, K = 1.</w:t>
+        <w:t>Преобразования реализованы тремя классами: RGBModel, CMYKModel и HLSModel. Прямых формул между CMYK и HLS нет, поэтому эти пары считаются через RGB (CMYK -&gt; RGB -&gt; HLS и HLS -&gt; RGB -&gt; CMYK). Преобразования RGB -&gt; CMYK и CMYK -&gt; RGB показаны на рисунке 2. В RGB -&gt; CMYK для чёрного цвета (K = 1) знаменатель 1 − K равен нулю, поэтому этот случай обработан отдельно: возвращается C = M = Y = 0, K = 1.</w:t>
       </w:r>
     </w:p>
     <w:p>
@@ -667,7 +559,7 @@
         </w:rPr>
         <w:lastRenderedPageBreak/>
         <w:drawing>
-          <wp:inline distT="0" distB="0" distL="0" distR="0" wp14:anchorId="79542A15" wp14:editId="166A7F77">
+          <wp:inline distT="0" distB="0" distL="0" distR="0" wp14:anchorId="7E346F65" wp14:editId="3CA27F1C">
             <wp:extent cx="2735580" cy="1860579"/>
             <wp:effectExtent l="0" t="0" r="7620" b="6350"/>
             <wp:docPr id="2" name="Рисунок 2"/>
@@ -713,7 +605,7 @@
           <w:noProof/>
         </w:rPr>
         <w:drawing>
-          <wp:inline distT="0" distB="0" distL="0" distR="0" wp14:anchorId="6D03C8F9" wp14:editId="3F1CB9B9">
+          <wp:inline distT="0" distB="0" distL="0" distR="0" wp14:anchorId="40F3341B" wp14:editId="4D22CEF8">
             <wp:extent cx="3337560" cy="1544116"/>
             <wp:effectExtent l="0" t="0" r="0" b="0"/>
             <wp:docPr id="3" name="Рисунок 3"/>
@@ -761,19 +653,7 @@
         <w:keepLines/>
       </w:pPr>
       <w:r>
-        <w:t xml:space="preserve">Рисунок 2 — Преобразования RGB </w:t>
-      </w:r>
-      <w:r>
-        <w:t>-&gt;</w:t>
-      </w:r>
-      <w:r>
-        <w:t xml:space="preserve"> CMYK и CMYK </w:t>
-      </w:r>
-      <w:r>
-        <w:t>-&gt;</w:t>
-      </w:r>
-      <w:r>
-        <w:t xml:space="preserve"> RGB</w:t>
+        <w:t>Рисунок 2 — Преобразования RGB -&gt; CMYK и CMYK -&gt; RGB</w:t>
       </w:r>
     </w:p>
     <w:p>
@@ -781,19 +661,7 @@
         <w:keepNext/>
       </w:pPr>
       <w:r>
-        <w:t xml:space="preserve">Преобразование RGB </w:t>
-      </w:r>
-      <w:r>
-        <w:t>-&gt;</w:t>
-      </w:r>
-      <w:r>
-        <w:t xml:space="preserve"> HLS показано на рисунке 3. Для серых цветов (max = min) тон не определён, поэтому возвращается H = 0, S = 0. Формул</w:t>
-      </w:r>
-      <w:r>
-        <w:t xml:space="preserve">а </w:t>
-      </w:r>
-      <w:r>
-        <w:t>насыщенности выбирается по светлоте (L &lt; 0,5 или L ≥ 0,5), а формула тона — по тому, какой канал максимален.</w:t>
+        <w:t>Преобразование RGB -&gt; HLS показано на рисунке 3. Для серых цветов (max = min) тон не определён, поэтому возвращается H = 0, S = 0. Формула насыщенности выбирается по светлоте (L &lt; 0,5 или L ≥ 0,5), а формула тона — по тому, какой канал максимален.</w:t>
       </w:r>
     </w:p>
     <w:p>
@@ -804,10 +672,19 @@
         <w:jc w:val="center"/>
       </w:pPr>
       <w:r>
+        <w:rPr>
+          <w:noProof/>
+        </w:rPr>
+        <w:t xml:space="preserve"> </w:t>
+      </w:r>
+      <w:r>
+        <w:rPr>
+          <w:noProof/>
+        </w:rPr>
         <w:drawing>
-          <wp:inline distT="0" distB="0" distL="0" distR="0" wp14:anchorId="28387C6C" wp14:editId="1A09F24F">
-            <wp:extent cx="5229955" cy="3334215"/>
-            <wp:effectExtent l="0" t="0" r="8890" b="0"/>
+          <wp:inline distT="0" distB="0" distL="0" distR="0" wp14:anchorId="4B6ACDCB" wp14:editId="015158D5">
+            <wp:extent cx="5796971" cy="3695700"/>
+            <wp:effectExtent l="0" t="0" r="0" b="0"/>
             <wp:docPr id="4" name="Рисунок 4"/>
             <wp:cNvGraphicFramePr>
               <a:graphicFrameLocks xmlns:a="http://schemas.openxmlformats.org/drawingml/2006/main" noChangeAspect="1"/>
@@ -828,7 +705,7 @@
                   <pic:spPr>
                     <a:xfrm>
                       <a:off x="0" y="0"/>
-                      <a:ext cx="5229955" cy="3334215"/>
+                      <a:ext cx="5805710" cy="3701271"/>
                     </a:xfrm>
                     <a:prstGeom prst="rect">
                       <a:avLst/>
@@ -847,13 +724,7 @@
         <w:keepLines/>
       </w:pPr>
       <w:r>
-        <w:t xml:space="preserve">Рисунок 3 — Преобразование RGB </w:t>
-      </w:r>
-      <w:r>
-        <w:t>-&gt;</w:t>
-      </w:r>
-      <w:r>
-        <w:t xml:space="preserve"> HLS</w:t>
+        <w:t>Рисунок 3 — Преобразование RGB -&gt; HLS</w:t>
       </w:r>
     </w:p>
     <w:p>
@@ -861,13 +732,7 @@
         <w:keepNext/>
       </w:pPr>
       <w:r>
-        <w:t xml:space="preserve">Преобразование HLS </w:t>
-      </w:r>
-      <w:r>
-        <w:t>-&gt;</w:t>
-      </w:r>
-      <w:r>
-        <w:t xml:space="preserve"> RGB показано на рисунке 4. Сначала считаются вспомогательные величины m1 и m2, затем функция _value для каждого канала </w:t>
+        <w:t xml:space="preserve">Преобразование HLS -&gt; RGB показано на рисунке 4. Сначала считаются вспомогательные величины m1 и m2, затем функция _value для каждого канала </w:t>
       </w:r>
       <w:r>
         <w:lastRenderedPageBreak/>
@@ -882,8 +747,11 @@
         <w:jc w:val="center"/>
       </w:pPr>
       <w:r>
+        <w:rPr>
+          <w:noProof/>
+        </w:rPr>
         <w:drawing>
-          <wp:inline distT="0" distB="0" distL="0" distR="0" wp14:anchorId="7E452CC4" wp14:editId="0426EBE7">
+          <wp:inline distT="0" distB="0" distL="0" distR="0" wp14:anchorId="6B611A3D" wp14:editId="0738746C">
             <wp:extent cx="6120130" cy="3171190"/>
             <wp:effectExtent l="0" t="0" r="0" b="0"/>
             <wp:docPr id="5" name="Рисунок 5"/>
@@ -925,13 +793,7 @@
         <w:keepLines/>
       </w:pPr>
       <w:r>
-        <w:t xml:space="preserve">Рисунок 4 — Преобразование HLS </w:t>
-      </w:r>
-      <w:r>
-        <w:t>-&gt;</w:t>
-      </w:r>
-      <w:r>
-        <w:t xml:space="preserve"> RGB</w:t>
+        <w:t>Рисунок 4 — Преобразование HLS -&gt; RGB</w:t>
       </w:r>
     </w:p>
     <w:p>
@@ -958,16 +820,2193 @@
     </w:p>
     <w:p>
       <w:r>
-        <w:t>Значения получены в порядке RGB, CMYK (C / M / Y / K, %), HLS (H° / S % / L %): красный (255, 0, 0) — 0 / 100 / 100 / 0 и 0 / 100 / 50; зелёный (0, 255, 0) — 100 / 0 / 100 / 0 и 120 / 100 / 50; синий (0, 0, 255) — 100 / 100 / 0 / 0 и 240 / 100 / 50; белый (255, 255, 255) — 0 / 0 / 0 / 0 и 0 / 0 / 100; чёрный (0, 0, 0) — 0 / 0 / 0 / 100 и 0 / 0 / 0; серый (128, 128, 128) — 0 / 0 / 0 / 49,8 и 0 / 0 / 50,2; произвольный (200, 100, 50) — 0 / 50 / 75 / 21,6 и 20 / 60 / 49.</w:t>
-      </w:r>
-    </w:p>
-    <w:p>
-      <w:pPr>
+        <w:t>Результаты проверки приведены в таблице 1: для каждого цвета указаны значения во всех трёх моделях.</w:t>
+      </w:r>
+    </w:p>
+    <w:p>
+      <w:pPr>
+        <w:keepNext/>
+        <w:spacing w:before="120" w:after="60"/>
+        <w:ind w:firstLine="0"/>
+        <w:jc w:val="left"/>
+      </w:pPr>
+      <w:r>
+        <w:t>Таблица 1 — Контрольные и произвольный цвета в моделях RGB, CMYK и HLS</w:t>
+      </w:r>
+    </w:p>
+    <w:tbl>
+      <w:tblPr>
+        <w:tblW w:w="9638" w:type="dxa"/>
         <w:jc w:val="center"/>
-      </w:pPr>
-      <w:r>
+        <w:tblLayout w:type="fixed"/>
+        <w:tblCellMar>
+          <w:left w:w="60" w:type="dxa"/>
+          <w:right w:w="60" w:type="dxa"/>
+        </w:tblCellMar>
+        <w:tblLook w:val="04A0" w:firstRow="1" w:lastRow="0" w:firstColumn="1" w:lastColumn="0" w:noHBand="0" w:noVBand="1"/>
+      </w:tblPr>
+      <w:tblGrid>
+        <w:gridCol w:w="1700"/>
+        <w:gridCol w:w="1738"/>
+        <w:gridCol w:w="850"/>
+        <w:gridCol w:w="850"/>
+        <w:gridCol w:w="850"/>
+        <w:gridCol w:w="850"/>
+        <w:gridCol w:w="933"/>
+        <w:gridCol w:w="933"/>
+        <w:gridCol w:w="934"/>
+      </w:tblGrid>
+      <w:tr>
+        <w:trPr>
+          <w:cantSplit/>
+          <w:tblHeader/>
+          <w:jc w:val="center"/>
+        </w:trPr>
+        <w:tc>
+          <w:tcPr>
+            <w:tcW w:w="1700" w:type="dxa"/>
+            <w:vMerge w:val="restart"/>
+            <w:tcBorders>
+              <w:top w:val="single" w:sz="4" w:space="0" w:color="000000"/>
+              <w:left w:val="single" w:sz="4" w:space="0" w:color="000000"/>
+              <w:bottom w:val="single" w:sz="4" w:space="0" w:color="000000"/>
+              <w:right w:val="single" w:sz="4" w:space="0" w:color="000000"/>
+            </w:tcBorders>
+            <w:shd w:val="clear" w:color="auto" w:fill="F2F2F2"/>
+            <w:vAlign w:val="center"/>
+          </w:tcPr>
+          <w:p>
+            <w:pPr>
+              <w:keepNext/>
+              <w:spacing w:before="40" w:after="40"/>
+              <w:ind w:firstLine="0"/>
+              <w:jc w:val="center"/>
+            </w:pPr>
+            <w:r>
+              <w:rPr>
+                <w:b/>
+                <w:bCs/>
+                <w:sz w:val="22"/>
+                <w:szCs w:val="22"/>
+              </w:rPr>
+              <w:t>Цвет</w:t>
+            </w:r>
+          </w:p>
+        </w:tc>
+        <w:tc>
+          <w:tcPr>
+            <w:tcW w:w="1738" w:type="dxa"/>
+            <w:vMerge w:val="restart"/>
+            <w:tcBorders>
+              <w:top w:val="single" w:sz="4" w:space="0" w:color="000000"/>
+              <w:left w:val="single" w:sz="4" w:space="0" w:color="000000"/>
+              <w:bottom w:val="single" w:sz="4" w:space="0" w:color="000000"/>
+              <w:right w:val="single" w:sz="4" w:space="0" w:color="000000"/>
+            </w:tcBorders>
+            <w:shd w:val="clear" w:color="auto" w:fill="F2F2F2"/>
+            <w:vAlign w:val="center"/>
+          </w:tcPr>
+          <w:p>
+            <w:pPr>
+              <w:keepNext/>
+              <w:spacing w:before="40" w:after="40"/>
+              <w:ind w:firstLine="0"/>
+              <w:jc w:val="center"/>
+            </w:pPr>
+            <w:r>
+              <w:rPr>
+                <w:b/>
+                <w:bCs/>
+                <w:sz w:val="22"/>
+                <w:szCs w:val="22"/>
+              </w:rPr>
+              <w:t>RGB</w:t>
+            </w:r>
+          </w:p>
+        </w:tc>
+        <w:tc>
+          <w:tcPr>
+            <w:tcW w:w="3400" w:type="dxa"/>
+            <w:gridSpan w:val="4"/>
+            <w:tcBorders>
+              <w:top w:val="single" w:sz="4" w:space="0" w:color="000000"/>
+              <w:left w:val="single" w:sz="4" w:space="0" w:color="000000"/>
+              <w:bottom w:val="single" w:sz="4" w:space="0" w:color="000000"/>
+              <w:right w:val="single" w:sz="4" w:space="0" w:color="000000"/>
+            </w:tcBorders>
+            <w:shd w:val="clear" w:color="auto" w:fill="F2F2F2"/>
+            <w:vAlign w:val="center"/>
+          </w:tcPr>
+          <w:p>
+            <w:pPr>
+              <w:keepNext/>
+              <w:spacing w:before="40" w:after="40"/>
+              <w:ind w:firstLine="0"/>
+              <w:jc w:val="center"/>
+            </w:pPr>
+            <w:r>
+              <w:rPr>
+                <w:b/>
+                <w:bCs/>
+                <w:sz w:val="22"/>
+                <w:szCs w:val="22"/>
+              </w:rPr>
+              <w:t>CMYK, %</w:t>
+            </w:r>
+          </w:p>
+        </w:tc>
+        <w:tc>
+          <w:tcPr>
+            <w:tcW w:w="2800" w:type="dxa"/>
+            <w:gridSpan w:val="3"/>
+            <w:tcBorders>
+              <w:top w:val="single" w:sz="4" w:space="0" w:color="000000"/>
+              <w:left w:val="single" w:sz="4" w:space="0" w:color="000000"/>
+              <w:bottom w:val="single" w:sz="4" w:space="0" w:color="000000"/>
+              <w:right w:val="single" w:sz="4" w:space="0" w:color="000000"/>
+            </w:tcBorders>
+            <w:shd w:val="clear" w:color="auto" w:fill="F2F2F2"/>
+            <w:vAlign w:val="center"/>
+          </w:tcPr>
+          <w:p>
+            <w:pPr>
+              <w:keepNext/>
+              <w:spacing w:before="40" w:after="40"/>
+              <w:ind w:firstLine="0"/>
+              <w:jc w:val="center"/>
+            </w:pPr>
+            <w:r>
+              <w:rPr>
+                <w:b/>
+                <w:bCs/>
+                <w:sz w:val="22"/>
+                <w:szCs w:val="22"/>
+              </w:rPr>
+              <w:t>HLS</w:t>
+            </w:r>
+          </w:p>
+        </w:tc>
+      </w:tr>
+      <w:tr>
+        <w:trPr>
+          <w:cantSplit/>
+          <w:tblHeader/>
+          <w:jc w:val="center"/>
+        </w:trPr>
+        <w:tc>
+          <w:tcPr>
+            <w:tcW w:w="1700" w:type="dxa"/>
+            <w:vMerge/>
+            <w:tcBorders>
+              <w:top w:val="single" w:sz="4" w:space="0" w:color="000000"/>
+              <w:left w:val="single" w:sz="4" w:space="0" w:color="000000"/>
+              <w:bottom w:val="single" w:sz="4" w:space="0" w:color="000000"/>
+              <w:right w:val="single" w:sz="4" w:space="0" w:color="000000"/>
+            </w:tcBorders>
+            <w:shd w:val="clear" w:color="auto" w:fill="F2F2F2"/>
+            <w:vAlign w:val="center"/>
+          </w:tcPr>
+          <w:p>
+            <w:pPr>
+              <w:keepNext/>
+              <w:spacing w:before="40" w:after="40"/>
+              <w:ind w:firstLine="0"/>
+              <w:jc w:val="center"/>
+            </w:pPr>
+          </w:p>
+        </w:tc>
+        <w:tc>
+          <w:tcPr>
+            <w:tcW w:w="1738" w:type="dxa"/>
+            <w:vMerge/>
+            <w:tcBorders>
+              <w:top w:val="single" w:sz="4" w:space="0" w:color="000000"/>
+              <w:left w:val="single" w:sz="4" w:space="0" w:color="000000"/>
+              <w:bottom w:val="single" w:sz="4" w:space="0" w:color="000000"/>
+              <w:right w:val="single" w:sz="4" w:space="0" w:color="000000"/>
+            </w:tcBorders>
+            <w:shd w:val="clear" w:color="auto" w:fill="F2F2F2"/>
+            <w:vAlign w:val="center"/>
+          </w:tcPr>
+          <w:p>
+            <w:pPr>
+              <w:keepNext/>
+              <w:spacing w:before="40" w:after="40"/>
+              <w:ind w:firstLine="0"/>
+              <w:jc w:val="center"/>
+            </w:pPr>
+          </w:p>
+        </w:tc>
+        <w:tc>
+          <w:tcPr>
+            <w:tcW w:w="850" w:type="dxa"/>
+            <w:tcBorders>
+              <w:top w:val="single" w:sz="4" w:space="0" w:color="000000"/>
+              <w:left w:val="single" w:sz="4" w:space="0" w:color="000000"/>
+              <w:bottom w:val="single" w:sz="4" w:space="0" w:color="000000"/>
+              <w:right w:val="single" w:sz="4" w:space="0" w:color="000000"/>
+            </w:tcBorders>
+            <w:shd w:val="clear" w:color="auto" w:fill="F2F2F2"/>
+            <w:vAlign w:val="center"/>
+          </w:tcPr>
+          <w:p>
+            <w:pPr>
+              <w:keepNext/>
+              <w:spacing w:before="40" w:after="40"/>
+              <w:ind w:firstLine="0"/>
+              <w:jc w:val="center"/>
+            </w:pPr>
+            <w:r>
+              <w:rPr>
+                <w:b/>
+                <w:bCs/>
+                <w:sz w:val="22"/>
+                <w:szCs w:val="22"/>
+              </w:rPr>
+              <w:t>C</w:t>
+            </w:r>
+          </w:p>
+        </w:tc>
+        <w:tc>
+          <w:tcPr>
+            <w:tcW w:w="850" w:type="dxa"/>
+            <w:tcBorders>
+              <w:top w:val="single" w:sz="4" w:space="0" w:color="000000"/>
+              <w:left w:val="single" w:sz="4" w:space="0" w:color="000000"/>
+              <w:bottom w:val="single" w:sz="4" w:space="0" w:color="000000"/>
+              <w:right w:val="single" w:sz="4" w:space="0" w:color="000000"/>
+            </w:tcBorders>
+            <w:shd w:val="clear" w:color="auto" w:fill="F2F2F2"/>
+            <w:vAlign w:val="center"/>
+          </w:tcPr>
+          <w:p>
+            <w:pPr>
+              <w:keepNext/>
+              <w:spacing w:before="40" w:after="40"/>
+              <w:ind w:firstLine="0"/>
+              <w:jc w:val="center"/>
+            </w:pPr>
+            <w:r>
+              <w:rPr>
+                <w:b/>
+                <w:bCs/>
+                <w:sz w:val="22"/>
+                <w:szCs w:val="22"/>
+              </w:rPr>
+              <w:t>M</w:t>
+            </w:r>
+          </w:p>
+        </w:tc>
+        <w:tc>
+          <w:tcPr>
+            <w:tcW w:w="850" w:type="dxa"/>
+            <w:tcBorders>
+              <w:top w:val="single" w:sz="4" w:space="0" w:color="000000"/>
+              <w:left w:val="single" w:sz="4" w:space="0" w:color="000000"/>
+              <w:bottom w:val="single" w:sz="4" w:space="0" w:color="000000"/>
+              <w:right w:val="single" w:sz="4" w:space="0" w:color="000000"/>
+            </w:tcBorders>
+            <w:shd w:val="clear" w:color="auto" w:fill="F2F2F2"/>
+            <w:vAlign w:val="center"/>
+          </w:tcPr>
+          <w:p>
+            <w:pPr>
+              <w:keepNext/>
+              <w:spacing w:before="40" w:after="40"/>
+              <w:ind w:firstLine="0"/>
+              <w:jc w:val="center"/>
+            </w:pPr>
+            <w:r>
+              <w:rPr>
+                <w:b/>
+                <w:bCs/>
+                <w:sz w:val="22"/>
+                <w:szCs w:val="22"/>
+              </w:rPr>
+              <w:t>Y</w:t>
+            </w:r>
+          </w:p>
+        </w:tc>
+        <w:tc>
+          <w:tcPr>
+            <w:tcW w:w="850" w:type="dxa"/>
+            <w:tcBorders>
+              <w:top w:val="single" w:sz="4" w:space="0" w:color="000000"/>
+              <w:left w:val="single" w:sz="4" w:space="0" w:color="000000"/>
+              <w:bottom w:val="single" w:sz="4" w:space="0" w:color="000000"/>
+              <w:right w:val="single" w:sz="4" w:space="0" w:color="000000"/>
+            </w:tcBorders>
+            <w:shd w:val="clear" w:color="auto" w:fill="F2F2F2"/>
+            <w:vAlign w:val="center"/>
+          </w:tcPr>
+          <w:p>
+            <w:pPr>
+              <w:keepNext/>
+              <w:spacing w:before="40" w:after="40"/>
+              <w:ind w:firstLine="0"/>
+              <w:jc w:val="center"/>
+            </w:pPr>
+            <w:r>
+              <w:rPr>
+                <w:b/>
+                <w:bCs/>
+                <w:sz w:val="22"/>
+                <w:szCs w:val="22"/>
+              </w:rPr>
+              <w:t>K</w:t>
+            </w:r>
+          </w:p>
+        </w:tc>
+        <w:tc>
+          <w:tcPr>
+            <w:tcW w:w="933" w:type="dxa"/>
+            <w:tcBorders>
+              <w:top w:val="single" w:sz="4" w:space="0" w:color="000000"/>
+              <w:left w:val="single" w:sz="4" w:space="0" w:color="000000"/>
+              <w:bottom w:val="single" w:sz="4" w:space="0" w:color="000000"/>
+              <w:right w:val="single" w:sz="4" w:space="0" w:color="000000"/>
+            </w:tcBorders>
+            <w:shd w:val="clear" w:color="auto" w:fill="F2F2F2"/>
+            <w:vAlign w:val="center"/>
+          </w:tcPr>
+          <w:p>
+            <w:pPr>
+              <w:keepNext/>
+              <w:spacing w:before="40" w:after="40"/>
+              <w:ind w:firstLine="0"/>
+              <w:jc w:val="center"/>
+            </w:pPr>
+            <w:r>
+              <w:rPr>
+                <w:b/>
+                <w:bCs/>
+                <w:sz w:val="22"/>
+                <w:szCs w:val="22"/>
+              </w:rPr>
+              <w:t>H, °</w:t>
+            </w:r>
+          </w:p>
+        </w:tc>
+        <w:tc>
+          <w:tcPr>
+            <w:tcW w:w="933" w:type="dxa"/>
+            <w:tcBorders>
+              <w:top w:val="single" w:sz="4" w:space="0" w:color="000000"/>
+              <w:left w:val="single" w:sz="4" w:space="0" w:color="000000"/>
+              <w:bottom w:val="single" w:sz="4" w:space="0" w:color="000000"/>
+              <w:right w:val="single" w:sz="4" w:space="0" w:color="000000"/>
+            </w:tcBorders>
+            <w:shd w:val="clear" w:color="auto" w:fill="F2F2F2"/>
+            <w:vAlign w:val="center"/>
+          </w:tcPr>
+          <w:p>
+            <w:pPr>
+              <w:keepNext/>
+              <w:spacing w:before="40" w:after="40"/>
+              <w:ind w:firstLine="0"/>
+              <w:jc w:val="center"/>
+            </w:pPr>
+            <w:r>
+              <w:rPr>
+                <w:b/>
+                <w:bCs/>
+                <w:sz w:val="22"/>
+                <w:szCs w:val="22"/>
+              </w:rPr>
+              <w:t>S, %</w:t>
+            </w:r>
+          </w:p>
+        </w:tc>
+        <w:tc>
+          <w:tcPr>
+            <w:tcW w:w="934" w:type="dxa"/>
+            <w:tcBorders>
+              <w:top w:val="single" w:sz="4" w:space="0" w:color="000000"/>
+              <w:left w:val="single" w:sz="4" w:space="0" w:color="000000"/>
+              <w:bottom w:val="single" w:sz="4" w:space="0" w:color="000000"/>
+              <w:right w:val="single" w:sz="4" w:space="0" w:color="000000"/>
+            </w:tcBorders>
+            <w:shd w:val="clear" w:color="auto" w:fill="F2F2F2"/>
+            <w:vAlign w:val="center"/>
+          </w:tcPr>
+          <w:p>
+            <w:pPr>
+              <w:keepNext/>
+              <w:spacing w:before="40" w:after="40"/>
+              <w:ind w:firstLine="0"/>
+              <w:jc w:val="center"/>
+            </w:pPr>
+            <w:r>
+              <w:rPr>
+                <w:b/>
+                <w:bCs/>
+                <w:sz w:val="22"/>
+                <w:szCs w:val="22"/>
+              </w:rPr>
+              <w:t>L, %</w:t>
+            </w:r>
+          </w:p>
+        </w:tc>
+      </w:tr>
+      <w:tr>
+        <w:trPr>
+          <w:cantSplit/>
+          <w:jc w:val="center"/>
+        </w:trPr>
+        <w:tc>
+          <w:tcPr>
+            <w:tcW w:w="1700" w:type="dxa"/>
+            <w:tcBorders>
+              <w:top w:val="single" w:sz="4" w:space="0" w:color="000000"/>
+              <w:left w:val="single" w:sz="4" w:space="0" w:color="000000"/>
+              <w:bottom w:val="single" w:sz="4" w:space="0" w:color="000000"/>
+              <w:right w:val="single" w:sz="4" w:space="0" w:color="000000"/>
+            </w:tcBorders>
+            <w:vAlign w:val="center"/>
+          </w:tcPr>
+          <w:p>
+            <w:pPr>
+              <w:keepNext/>
+              <w:spacing w:before="40" w:after="40"/>
+              <w:ind w:firstLine="0"/>
+              <w:jc w:val="left"/>
+            </w:pPr>
+            <w:r>
+              <w:rPr>
+                <w:sz w:val="22"/>
+                <w:szCs w:val="22"/>
+              </w:rPr>
+              <w:t>Красный</w:t>
+            </w:r>
+          </w:p>
+        </w:tc>
+        <w:tc>
+          <w:tcPr>
+            <w:tcW w:w="1738" w:type="dxa"/>
+            <w:tcBorders>
+              <w:top w:val="single" w:sz="4" w:space="0" w:color="000000"/>
+              <w:left w:val="single" w:sz="4" w:space="0" w:color="000000"/>
+              <w:bottom w:val="single" w:sz="4" w:space="0" w:color="000000"/>
+              <w:right w:val="single" w:sz="4" w:space="0" w:color="000000"/>
+            </w:tcBorders>
+            <w:vAlign w:val="center"/>
+          </w:tcPr>
+          <w:p>
+            <w:pPr>
+              <w:keepNext/>
+              <w:spacing w:before="40" w:after="40"/>
+              <w:ind w:firstLine="0"/>
+              <w:jc w:val="center"/>
+            </w:pPr>
+            <w:r>
+              <w:rPr>
+                <w:sz w:val="22"/>
+                <w:szCs w:val="22"/>
+              </w:rPr>
+              <w:t>255, 0, 0</w:t>
+            </w:r>
+          </w:p>
+        </w:tc>
+        <w:tc>
+          <w:tcPr>
+            <w:tcW w:w="850" w:type="dxa"/>
+            <w:tcBorders>
+              <w:top w:val="single" w:sz="4" w:space="0" w:color="000000"/>
+              <w:left w:val="single" w:sz="4" w:space="0" w:color="000000"/>
+              <w:bottom w:val="single" w:sz="4" w:space="0" w:color="000000"/>
+              <w:right w:val="single" w:sz="4" w:space="0" w:color="000000"/>
+            </w:tcBorders>
+            <w:vAlign w:val="center"/>
+          </w:tcPr>
+          <w:p>
+            <w:pPr>
+              <w:keepNext/>
+              <w:spacing w:before="40" w:after="40"/>
+              <w:ind w:firstLine="0"/>
+              <w:jc w:val="center"/>
+            </w:pPr>
+            <w:r>
+              <w:rPr>
+                <w:sz w:val="22"/>
+                <w:szCs w:val="22"/>
+              </w:rPr>
+              <w:t>0</w:t>
+            </w:r>
+          </w:p>
+        </w:tc>
+        <w:tc>
+          <w:tcPr>
+            <w:tcW w:w="850" w:type="dxa"/>
+            <w:tcBorders>
+              <w:top w:val="single" w:sz="4" w:space="0" w:color="000000"/>
+              <w:left w:val="single" w:sz="4" w:space="0" w:color="000000"/>
+              <w:bottom w:val="single" w:sz="4" w:space="0" w:color="000000"/>
+              <w:right w:val="single" w:sz="4" w:space="0" w:color="000000"/>
+            </w:tcBorders>
+            <w:vAlign w:val="center"/>
+          </w:tcPr>
+          <w:p>
+            <w:pPr>
+              <w:keepNext/>
+              <w:spacing w:before="40" w:after="40"/>
+              <w:ind w:firstLine="0"/>
+              <w:jc w:val="center"/>
+            </w:pPr>
+            <w:r>
+              <w:rPr>
+                <w:sz w:val="22"/>
+                <w:szCs w:val="22"/>
+              </w:rPr>
+              <w:t>100</w:t>
+            </w:r>
+          </w:p>
+        </w:tc>
+        <w:tc>
+          <w:tcPr>
+            <w:tcW w:w="850" w:type="dxa"/>
+            <w:tcBorders>
+              <w:top w:val="single" w:sz="4" w:space="0" w:color="000000"/>
+              <w:left w:val="single" w:sz="4" w:space="0" w:color="000000"/>
+              <w:bottom w:val="single" w:sz="4" w:space="0" w:color="000000"/>
+              <w:right w:val="single" w:sz="4" w:space="0" w:color="000000"/>
+            </w:tcBorders>
+            <w:vAlign w:val="center"/>
+          </w:tcPr>
+          <w:p>
+            <w:pPr>
+              <w:keepNext/>
+              <w:spacing w:before="40" w:after="40"/>
+              <w:ind w:firstLine="0"/>
+              <w:jc w:val="center"/>
+            </w:pPr>
+            <w:r>
+              <w:rPr>
+                <w:sz w:val="22"/>
+                <w:szCs w:val="22"/>
+              </w:rPr>
+              <w:t>100</w:t>
+            </w:r>
+          </w:p>
+        </w:tc>
+        <w:tc>
+          <w:tcPr>
+            <w:tcW w:w="850" w:type="dxa"/>
+            <w:tcBorders>
+              <w:top w:val="single" w:sz="4" w:space="0" w:color="000000"/>
+              <w:left w:val="single" w:sz="4" w:space="0" w:color="000000"/>
+              <w:bottom w:val="single" w:sz="4" w:space="0" w:color="000000"/>
+              <w:right w:val="single" w:sz="4" w:space="0" w:color="000000"/>
+            </w:tcBorders>
+            <w:vAlign w:val="center"/>
+          </w:tcPr>
+          <w:p>
+            <w:pPr>
+              <w:keepNext/>
+              <w:spacing w:before="40" w:after="40"/>
+              <w:ind w:firstLine="0"/>
+              <w:jc w:val="center"/>
+            </w:pPr>
+            <w:r>
+              <w:rPr>
+                <w:sz w:val="22"/>
+                <w:szCs w:val="22"/>
+              </w:rPr>
+              <w:t>0</w:t>
+            </w:r>
+          </w:p>
+        </w:tc>
+        <w:tc>
+          <w:tcPr>
+            <w:tcW w:w="933" w:type="dxa"/>
+            <w:tcBorders>
+              <w:top w:val="single" w:sz="4" w:space="0" w:color="000000"/>
+              <w:left w:val="single" w:sz="4" w:space="0" w:color="000000"/>
+              <w:bottom w:val="single" w:sz="4" w:space="0" w:color="000000"/>
+              <w:right w:val="single" w:sz="4" w:space="0" w:color="000000"/>
+            </w:tcBorders>
+            <w:vAlign w:val="center"/>
+          </w:tcPr>
+          <w:p>
+            <w:pPr>
+              <w:keepNext/>
+              <w:spacing w:before="40" w:after="40"/>
+              <w:ind w:firstLine="0"/>
+              <w:jc w:val="center"/>
+            </w:pPr>
+            <w:r>
+              <w:rPr>
+                <w:sz w:val="22"/>
+                <w:szCs w:val="22"/>
+              </w:rPr>
+              <w:t>0</w:t>
+            </w:r>
+          </w:p>
+        </w:tc>
+        <w:tc>
+          <w:tcPr>
+            <w:tcW w:w="933" w:type="dxa"/>
+            <w:tcBorders>
+              <w:top w:val="single" w:sz="4" w:space="0" w:color="000000"/>
+              <w:left w:val="single" w:sz="4" w:space="0" w:color="000000"/>
+              <w:bottom w:val="single" w:sz="4" w:space="0" w:color="000000"/>
+              <w:right w:val="single" w:sz="4" w:space="0" w:color="000000"/>
+            </w:tcBorders>
+            <w:vAlign w:val="center"/>
+          </w:tcPr>
+          <w:p>
+            <w:pPr>
+              <w:keepNext/>
+              <w:spacing w:before="40" w:after="40"/>
+              <w:ind w:firstLine="0"/>
+              <w:jc w:val="center"/>
+            </w:pPr>
+            <w:r>
+              <w:rPr>
+                <w:sz w:val="22"/>
+                <w:szCs w:val="22"/>
+              </w:rPr>
+              <w:t>100</w:t>
+            </w:r>
+          </w:p>
+        </w:tc>
+        <w:tc>
+          <w:tcPr>
+            <w:tcW w:w="934" w:type="dxa"/>
+            <w:tcBorders>
+              <w:top w:val="single" w:sz="4" w:space="0" w:color="000000"/>
+              <w:left w:val="single" w:sz="4" w:space="0" w:color="000000"/>
+              <w:bottom w:val="single" w:sz="4" w:space="0" w:color="000000"/>
+              <w:right w:val="single" w:sz="4" w:space="0" w:color="000000"/>
+            </w:tcBorders>
+            <w:vAlign w:val="center"/>
+          </w:tcPr>
+          <w:p>
+            <w:pPr>
+              <w:keepNext/>
+              <w:spacing w:before="40" w:after="40"/>
+              <w:ind w:firstLine="0"/>
+              <w:jc w:val="center"/>
+            </w:pPr>
+            <w:r>
+              <w:rPr>
+                <w:sz w:val="22"/>
+                <w:szCs w:val="22"/>
+              </w:rPr>
+              <w:t>50</w:t>
+            </w:r>
+          </w:p>
+        </w:tc>
+      </w:tr>
+      <w:tr>
+        <w:trPr>
+          <w:cantSplit/>
+          <w:jc w:val="center"/>
+        </w:trPr>
+        <w:tc>
+          <w:tcPr>
+            <w:tcW w:w="1700" w:type="dxa"/>
+            <w:tcBorders>
+              <w:top w:val="single" w:sz="4" w:space="0" w:color="000000"/>
+              <w:left w:val="single" w:sz="4" w:space="0" w:color="000000"/>
+              <w:bottom w:val="single" w:sz="4" w:space="0" w:color="000000"/>
+              <w:right w:val="single" w:sz="4" w:space="0" w:color="000000"/>
+            </w:tcBorders>
+            <w:vAlign w:val="center"/>
+          </w:tcPr>
+          <w:p>
+            <w:pPr>
+              <w:keepNext/>
+              <w:spacing w:before="40" w:after="40"/>
+              <w:ind w:firstLine="0"/>
+              <w:jc w:val="left"/>
+            </w:pPr>
+            <w:r>
+              <w:rPr>
+                <w:sz w:val="22"/>
+                <w:szCs w:val="22"/>
+              </w:rPr>
+              <w:t>Зелёный</w:t>
+            </w:r>
+          </w:p>
+        </w:tc>
+        <w:tc>
+          <w:tcPr>
+            <w:tcW w:w="1738" w:type="dxa"/>
+            <w:tcBorders>
+              <w:top w:val="single" w:sz="4" w:space="0" w:color="000000"/>
+              <w:left w:val="single" w:sz="4" w:space="0" w:color="000000"/>
+              <w:bottom w:val="single" w:sz="4" w:space="0" w:color="000000"/>
+              <w:right w:val="single" w:sz="4" w:space="0" w:color="000000"/>
+            </w:tcBorders>
+            <w:vAlign w:val="center"/>
+          </w:tcPr>
+          <w:p>
+            <w:pPr>
+              <w:keepNext/>
+              <w:spacing w:before="40" w:after="40"/>
+              <w:ind w:firstLine="0"/>
+              <w:jc w:val="center"/>
+            </w:pPr>
+            <w:r>
+              <w:rPr>
+                <w:sz w:val="22"/>
+                <w:szCs w:val="22"/>
+              </w:rPr>
+              <w:t>0, 255, 0</w:t>
+            </w:r>
+          </w:p>
+        </w:tc>
+        <w:tc>
+          <w:tcPr>
+            <w:tcW w:w="850" w:type="dxa"/>
+            <w:tcBorders>
+              <w:top w:val="single" w:sz="4" w:space="0" w:color="000000"/>
+              <w:left w:val="single" w:sz="4" w:space="0" w:color="000000"/>
+              <w:bottom w:val="single" w:sz="4" w:space="0" w:color="000000"/>
+              <w:right w:val="single" w:sz="4" w:space="0" w:color="000000"/>
+            </w:tcBorders>
+            <w:vAlign w:val="center"/>
+          </w:tcPr>
+          <w:p>
+            <w:pPr>
+              <w:keepNext/>
+              <w:spacing w:before="40" w:after="40"/>
+              <w:ind w:firstLine="0"/>
+              <w:jc w:val="center"/>
+            </w:pPr>
+            <w:r>
+              <w:rPr>
+                <w:sz w:val="22"/>
+                <w:szCs w:val="22"/>
+              </w:rPr>
+              <w:t>100</w:t>
+            </w:r>
+          </w:p>
+        </w:tc>
+        <w:tc>
+          <w:tcPr>
+            <w:tcW w:w="850" w:type="dxa"/>
+            <w:tcBorders>
+              <w:top w:val="single" w:sz="4" w:space="0" w:color="000000"/>
+              <w:left w:val="single" w:sz="4" w:space="0" w:color="000000"/>
+              <w:bottom w:val="single" w:sz="4" w:space="0" w:color="000000"/>
+              <w:right w:val="single" w:sz="4" w:space="0" w:color="000000"/>
+            </w:tcBorders>
+            <w:vAlign w:val="center"/>
+          </w:tcPr>
+          <w:p>
+            <w:pPr>
+              <w:keepNext/>
+              <w:spacing w:before="40" w:after="40"/>
+              <w:ind w:firstLine="0"/>
+              <w:jc w:val="center"/>
+            </w:pPr>
+            <w:r>
+              <w:rPr>
+                <w:sz w:val="22"/>
+                <w:szCs w:val="22"/>
+              </w:rPr>
+              <w:t>0</w:t>
+            </w:r>
+          </w:p>
+        </w:tc>
+        <w:tc>
+          <w:tcPr>
+            <w:tcW w:w="850" w:type="dxa"/>
+            <w:tcBorders>
+              <w:top w:val="single" w:sz="4" w:space="0" w:color="000000"/>
+              <w:left w:val="single" w:sz="4" w:space="0" w:color="000000"/>
+              <w:bottom w:val="single" w:sz="4" w:space="0" w:color="000000"/>
+              <w:right w:val="single" w:sz="4" w:space="0" w:color="000000"/>
+            </w:tcBorders>
+            <w:vAlign w:val="center"/>
+          </w:tcPr>
+          <w:p>
+            <w:pPr>
+              <w:keepNext/>
+              <w:spacing w:before="40" w:after="40"/>
+              <w:ind w:firstLine="0"/>
+              <w:jc w:val="center"/>
+            </w:pPr>
+            <w:r>
+              <w:rPr>
+                <w:sz w:val="22"/>
+                <w:szCs w:val="22"/>
+              </w:rPr>
+              <w:t>100</w:t>
+            </w:r>
+          </w:p>
+        </w:tc>
+        <w:tc>
+          <w:tcPr>
+            <w:tcW w:w="850" w:type="dxa"/>
+            <w:tcBorders>
+              <w:top w:val="single" w:sz="4" w:space="0" w:color="000000"/>
+              <w:left w:val="single" w:sz="4" w:space="0" w:color="000000"/>
+              <w:bottom w:val="single" w:sz="4" w:space="0" w:color="000000"/>
+              <w:right w:val="single" w:sz="4" w:space="0" w:color="000000"/>
+            </w:tcBorders>
+            <w:vAlign w:val="center"/>
+          </w:tcPr>
+          <w:p>
+            <w:pPr>
+              <w:keepNext/>
+              <w:spacing w:before="40" w:after="40"/>
+              <w:ind w:firstLine="0"/>
+              <w:jc w:val="center"/>
+            </w:pPr>
+            <w:r>
+              <w:rPr>
+                <w:sz w:val="22"/>
+                <w:szCs w:val="22"/>
+              </w:rPr>
+              <w:t>0</w:t>
+            </w:r>
+          </w:p>
+        </w:tc>
+        <w:tc>
+          <w:tcPr>
+            <w:tcW w:w="933" w:type="dxa"/>
+            <w:tcBorders>
+              <w:top w:val="single" w:sz="4" w:space="0" w:color="000000"/>
+              <w:left w:val="single" w:sz="4" w:space="0" w:color="000000"/>
+              <w:bottom w:val="single" w:sz="4" w:space="0" w:color="000000"/>
+              <w:right w:val="single" w:sz="4" w:space="0" w:color="000000"/>
+            </w:tcBorders>
+            <w:vAlign w:val="center"/>
+          </w:tcPr>
+          <w:p>
+            <w:pPr>
+              <w:keepNext/>
+              <w:spacing w:before="40" w:after="40"/>
+              <w:ind w:firstLine="0"/>
+              <w:jc w:val="center"/>
+            </w:pPr>
+            <w:r>
+              <w:rPr>
+                <w:sz w:val="22"/>
+                <w:szCs w:val="22"/>
+              </w:rPr>
+              <w:t>120</w:t>
+            </w:r>
+          </w:p>
+        </w:tc>
+        <w:tc>
+          <w:tcPr>
+            <w:tcW w:w="933" w:type="dxa"/>
+            <w:tcBorders>
+              <w:top w:val="single" w:sz="4" w:space="0" w:color="000000"/>
+              <w:left w:val="single" w:sz="4" w:space="0" w:color="000000"/>
+              <w:bottom w:val="single" w:sz="4" w:space="0" w:color="000000"/>
+              <w:right w:val="single" w:sz="4" w:space="0" w:color="000000"/>
+            </w:tcBorders>
+            <w:vAlign w:val="center"/>
+          </w:tcPr>
+          <w:p>
+            <w:pPr>
+              <w:keepNext/>
+              <w:spacing w:before="40" w:after="40"/>
+              <w:ind w:firstLine="0"/>
+              <w:jc w:val="center"/>
+            </w:pPr>
+            <w:r>
+              <w:rPr>
+                <w:sz w:val="22"/>
+                <w:szCs w:val="22"/>
+              </w:rPr>
+              <w:t>100</w:t>
+            </w:r>
+          </w:p>
+        </w:tc>
+        <w:tc>
+          <w:tcPr>
+            <w:tcW w:w="934" w:type="dxa"/>
+            <w:tcBorders>
+              <w:top w:val="single" w:sz="4" w:space="0" w:color="000000"/>
+              <w:left w:val="single" w:sz="4" w:space="0" w:color="000000"/>
+              <w:bottom w:val="single" w:sz="4" w:space="0" w:color="000000"/>
+              <w:right w:val="single" w:sz="4" w:space="0" w:color="000000"/>
+            </w:tcBorders>
+            <w:vAlign w:val="center"/>
+          </w:tcPr>
+          <w:p>
+            <w:pPr>
+              <w:keepNext/>
+              <w:spacing w:before="40" w:after="40"/>
+              <w:ind w:firstLine="0"/>
+              <w:jc w:val="center"/>
+            </w:pPr>
+            <w:r>
+              <w:rPr>
+                <w:sz w:val="22"/>
+                <w:szCs w:val="22"/>
+              </w:rPr>
+              <w:t>50</w:t>
+            </w:r>
+          </w:p>
+        </w:tc>
+      </w:tr>
+      <w:tr>
+        <w:trPr>
+          <w:cantSplit/>
+          <w:jc w:val="center"/>
+        </w:trPr>
+        <w:tc>
+          <w:tcPr>
+            <w:tcW w:w="1700" w:type="dxa"/>
+            <w:tcBorders>
+              <w:top w:val="single" w:sz="4" w:space="0" w:color="000000"/>
+              <w:left w:val="single" w:sz="4" w:space="0" w:color="000000"/>
+              <w:bottom w:val="single" w:sz="4" w:space="0" w:color="000000"/>
+              <w:right w:val="single" w:sz="4" w:space="0" w:color="000000"/>
+            </w:tcBorders>
+            <w:vAlign w:val="center"/>
+          </w:tcPr>
+          <w:p>
+            <w:pPr>
+              <w:keepNext/>
+              <w:spacing w:before="40" w:after="40"/>
+              <w:ind w:firstLine="0"/>
+              <w:jc w:val="left"/>
+            </w:pPr>
+            <w:r>
+              <w:rPr>
+                <w:sz w:val="22"/>
+                <w:szCs w:val="22"/>
+              </w:rPr>
+              <w:t>Синий</w:t>
+            </w:r>
+          </w:p>
+        </w:tc>
+        <w:tc>
+          <w:tcPr>
+            <w:tcW w:w="1738" w:type="dxa"/>
+            <w:tcBorders>
+              <w:top w:val="single" w:sz="4" w:space="0" w:color="000000"/>
+              <w:left w:val="single" w:sz="4" w:space="0" w:color="000000"/>
+              <w:bottom w:val="single" w:sz="4" w:space="0" w:color="000000"/>
+              <w:right w:val="single" w:sz="4" w:space="0" w:color="000000"/>
+            </w:tcBorders>
+            <w:vAlign w:val="center"/>
+          </w:tcPr>
+          <w:p>
+            <w:pPr>
+              <w:keepNext/>
+              <w:spacing w:before="40" w:after="40"/>
+              <w:ind w:firstLine="0"/>
+              <w:jc w:val="center"/>
+            </w:pPr>
+            <w:r>
+              <w:rPr>
+                <w:sz w:val="22"/>
+                <w:szCs w:val="22"/>
+              </w:rPr>
+              <w:t>0, 0, 255</w:t>
+            </w:r>
+          </w:p>
+        </w:tc>
+        <w:tc>
+          <w:tcPr>
+            <w:tcW w:w="850" w:type="dxa"/>
+            <w:tcBorders>
+              <w:top w:val="single" w:sz="4" w:space="0" w:color="000000"/>
+              <w:left w:val="single" w:sz="4" w:space="0" w:color="000000"/>
+              <w:bottom w:val="single" w:sz="4" w:space="0" w:color="000000"/>
+              <w:right w:val="single" w:sz="4" w:space="0" w:color="000000"/>
+            </w:tcBorders>
+            <w:vAlign w:val="center"/>
+          </w:tcPr>
+          <w:p>
+            <w:pPr>
+              <w:keepNext/>
+              <w:spacing w:before="40" w:after="40"/>
+              <w:ind w:firstLine="0"/>
+              <w:jc w:val="center"/>
+            </w:pPr>
+            <w:r>
+              <w:rPr>
+                <w:sz w:val="22"/>
+                <w:szCs w:val="22"/>
+              </w:rPr>
+              <w:t>100</w:t>
+            </w:r>
+          </w:p>
+        </w:tc>
+        <w:tc>
+          <w:tcPr>
+            <w:tcW w:w="850" w:type="dxa"/>
+            <w:tcBorders>
+              <w:top w:val="single" w:sz="4" w:space="0" w:color="000000"/>
+              <w:left w:val="single" w:sz="4" w:space="0" w:color="000000"/>
+              <w:bottom w:val="single" w:sz="4" w:space="0" w:color="000000"/>
+              <w:right w:val="single" w:sz="4" w:space="0" w:color="000000"/>
+            </w:tcBorders>
+            <w:vAlign w:val="center"/>
+          </w:tcPr>
+          <w:p>
+            <w:pPr>
+              <w:keepNext/>
+              <w:spacing w:before="40" w:after="40"/>
+              <w:ind w:firstLine="0"/>
+              <w:jc w:val="center"/>
+            </w:pPr>
+            <w:r>
+              <w:rPr>
+                <w:sz w:val="22"/>
+                <w:szCs w:val="22"/>
+              </w:rPr>
+              <w:t>100</w:t>
+            </w:r>
+          </w:p>
+        </w:tc>
+        <w:tc>
+          <w:tcPr>
+            <w:tcW w:w="850" w:type="dxa"/>
+            <w:tcBorders>
+              <w:top w:val="single" w:sz="4" w:space="0" w:color="000000"/>
+              <w:left w:val="single" w:sz="4" w:space="0" w:color="000000"/>
+              <w:bottom w:val="single" w:sz="4" w:space="0" w:color="000000"/>
+              <w:right w:val="single" w:sz="4" w:space="0" w:color="000000"/>
+            </w:tcBorders>
+            <w:vAlign w:val="center"/>
+          </w:tcPr>
+          <w:p>
+            <w:pPr>
+              <w:keepNext/>
+              <w:spacing w:before="40" w:after="40"/>
+              <w:ind w:firstLine="0"/>
+              <w:jc w:val="center"/>
+            </w:pPr>
+            <w:r>
+              <w:rPr>
+                <w:sz w:val="22"/>
+                <w:szCs w:val="22"/>
+              </w:rPr>
+              <w:t>0</w:t>
+            </w:r>
+          </w:p>
+        </w:tc>
+        <w:tc>
+          <w:tcPr>
+            <w:tcW w:w="850" w:type="dxa"/>
+            <w:tcBorders>
+              <w:top w:val="single" w:sz="4" w:space="0" w:color="000000"/>
+              <w:left w:val="single" w:sz="4" w:space="0" w:color="000000"/>
+              <w:bottom w:val="single" w:sz="4" w:space="0" w:color="000000"/>
+              <w:right w:val="single" w:sz="4" w:space="0" w:color="000000"/>
+            </w:tcBorders>
+            <w:vAlign w:val="center"/>
+          </w:tcPr>
+          <w:p>
+            <w:pPr>
+              <w:keepNext/>
+              <w:spacing w:before="40" w:after="40"/>
+              <w:ind w:firstLine="0"/>
+              <w:jc w:val="center"/>
+            </w:pPr>
+            <w:r>
+              <w:rPr>
+                <w:sz w:val="22"/>
+                <w:szCs w:val="22"/>
+              </w:rPr>
+              <w:t>0</w:t>
+            </w:r>
+          </w:p>
+        </w:tc>
+        <w:tc>
+          <w:tcPr>
+            <w:tcW w:w="933" w:type="dxa"/>
+            <w:tcBorders>
+              <w:top w:val="single" w:sz="4" w:space="0" w:color="000000"/>
+              <w:left w:val="single" w:sz="4" w:space="0" w:color="000000"/>
+              <w:bottom w:val="single" w:sz="4" w:space="0" w:color="000000"/>
+              <w:right w:val="single" w:sz="4" w:space="0" w:color="000000"/>
+            </w:tcBorders>
+            <w:vAlign w:val="center"/>
+          </w:tcPr>
+          <w:p>
+            <w:pPr>
+              <w:keepNext/>
+              <w:spacing w:before="40" w:after="40"/>
+              <w:ind w:firstLine="0"/>
+              <w:jc w:val="center"/>
+            </w:pPr>
+            <w:r>
+              <w:rPr>
+                <w:sz w:val="22"/>
+                <w:szCs w:val="22"/>
+              </w:rPr>
+              <w:t>240</w:t>
+            </w:r>
+          </w:p>
+        </w:tc>
+        <w:tc>
+          <w:tcPr>
+            <w:tcW w:w="933" w:type="dxa"/>
+            <w:tcBorders>
+              <w:top w:val="single" w:sz="4" w:space="0" w:color="000000"/>
+              <w:left w:val="single" w:sz="4" w:space="0" w:color="000000"/>
+              <w:bottom w:val="single" w:sz="4" w:space="0" w:color="000000"/>
+              <w:right w:val="single" w:sz="4" w:space="0" w:color="000000"/>
+            </w:tcBorders>
+            <w:vAlign w:val="center"/>
+          </w:tcPr>
+          <w:p>
+            <w:pPr>
+              <w:keepNext/>
+              <w:spacing w:before="40" w:after="40"/>
+              <w:ind w:firstLine="0"/>
+              <w:jc w:val="center"/>
+            </w:pPr>
+            <w:r>
+              <w:rPr>
+                <w:sz w:val="22"/>
+                <w:szCs w:val="22"/>
+              </w:rPr>
+              <w:t>100</w:t>
+            </w:r>
+          </w:p>
+        </w:tc>
+        <w:tc>
+          <w:tcPr>
+            <w:tcW w:w="934" w:type="dxa"/>
+            <w:tcBorders>
+              <w:top w:val="single" w:sz="4" w:space="0" w:color="000000"/>
+              <w:left w:val="single" w:sz="4" w:space="0" w:color="000000"/>
+              <w:bottom w:val="single" w:sz="4" w:space="0" w:color="000000"/>
+              <w:right w:val="single" w:sz="4" w:space="0" w:color="000000"/>
+            </w:tcBorders>
+            <w:vAlign w:val="center"/>
+          </w:tcPr>
+          <w:p>
+            <w:pPr>
+              <w:keepNext/>
+              <w:spacing w:before="40" w:after="40"/>
+              <w:ind w:firstLine="0"/>
+              <w:jc w:val="center"/>
+            </w:pPr>
+            <w:r>
+              <w:rPr>
+                <w:sz w:val="22"/>
+                <w:szCs w:val="22"/>
+              </w:rPr>
+              <w:t>50</w:t>
+            </w:r>
+          </w:p>
+        </w:tc>
+      </w:tr>
+      <w:tr>
+        <w:trPr>
+          <w:cantSplit/>
+          <w:jc w:val="center"/>
+        </w:trPr>
+        <w:tc>
+          <w:tcPr>
+            <w:tcW w:w="1700" w:type="dxa"/>
+            <w:tcBorders>
+              <w:top w:val="single" w:sz="4" w:space="0" w:color="000000"/>
+              <w:left w:val="single" w:sz="4" w:space="0" w:color="000000"/>
+              <w:bottom w:val="single" w:sz="4" w:space="0" w:color="000000"/>
+              <w:right w:val="single" w:sz="4" w:space="0" w:color="000000"/>
+            </w:tcBorders>
+            <w:vAlign w:val="center"/>
+          </w:tcPr>
+          <w:p>
+            <w:pPr>
+              <w:keepNext/>
+              <w:spacing w:before="40" w:after="40"/>
+              <w:ind w:firstLine="0"/>
+              <w:jc w:val="left"/>
+            </w:pPr>
+            <w:r>
+              <w:rPr>
+                <w:sz w:val="22"/>
+                <w:szCs w:val="22"/>
+              </w:rPr>
+              <w:t>Белый</w:t>
+            </w:r>
+          </w:p>
+        </w:tc>
+        <w:tc>
+          <w:tcPr>
+            <w:tcW w:w="1738" w:type="dxa"/>
+            <w:tcBorders>
+              <w:top w:val="single" w:sz="4" w:space="0" w:color="000000"/>
+              <w:left w:val="single" w:sz="4" w:space="0" w:color="000000"/>
+              <w:bottom w:val="single" w:sz="4" w:space="0" w:color="000000"/>
+              <w:right w:val="single" w:sz="4" w:space="0" w:color="000000"/>
+            </w:tcBorders>
+            <w:vAlign w:val="center"/>
+          </w:tcPr>
+          <w:p>
+            <w:pPr>
+              <w:keepNext/>
+              <w:spacing w:before="40" w:after="40"/>
+              <w:ind w:firstLine="0"/>
+              <w:jc w:val="center"/>
+            </w:pPr>
+            <w:r>
+              <w:rPr>
+                <w:sz w:val="22"/>
+                <w:szCs w:val="22"/>
+              </w:rPr>
+              <w:t>255, 255, 255</w:t>
+            </w:r>
+          </w:p>
+        </w:tc>
+        <w:tc>
+          <w:tcPr>
+            <w:tcW w:w="850" w:type="dxa"/>
+            <w:tcBorders>
+              <w:top w:val="single" w:sz="4" w:space="0" w:color="000000"/>
+              <w:left w:val="single" w:sz="4" w:space="0" w:color="000000"/>
+              <w:bottom w:val="single" w:sz="4" w:space="0" w:color="000000"/>
+              <w:right w:val="single" w:sz="4" w:space="0" w:color="000000"/>
+            </w:tcBorders>
+            <w:vAlign w:val="center"/>
+          </w:tcPr>
+          <w:p>
+            <w:pPr>
+              <w:keepNext/>
+              <w:spacing w:before="40" w:after="40"/>
+              <w:ind w:firstLine="0"/>
+              <w:jc w:val="center"/>
+            </w:pPr>
+            <w:r>
+              <w:rPr>
+                <w:sz w:val="22"/>
+                <w:szCs w:val="22"/>
+              </w:rPr>
+              <w:t>0</w:t>
+            </w:r>
+          </w:p>
+        </w:tc>
+        <w:tc>
+          <w:tcPr>
+            <w:tcW w:w="850" w:type="dxa"/>
+            <w:tcBorders>
+              <w:top w:val="single" w:sz="4" w:space="0" w:color="000000"/>
+              <w:left w:val="single" w:sz="4" w:space="0" w:color="000000"/>
+              <w:bottom w:val="single" w:sz="4" w:space="0" w:color="000000"/>
+              <w:right w:val="single" w:sz="4" w:space="0" w:color="000000"/>
+            </w:tcBorders>
+            <w:vAlign w:val="center"/>
+          </w:tcPr>
+          <w:p>
+            <w:pPr>
+              <w:keepNext/>
+              <w:spacing w:before="40" w:after="40"/>
+              <w:ind w:firstLine="0"/>
+              <w:jc w:val="center"/>
+            </w:pPr>
+            <w:r>
+              <w:rPr>
+                <w:sz w:val="22"/>
+                <w:szCs w:val="22"/>
+              </w:rPr>
+              <w:t>0</w:t>
+            </w:r>
+          </w:p>
+        </w:tc>
+        <w:tc>
+          <w:tcPr>
+            <w:tcW w:w="850" w:type="dxa"/>
+            <w:tcBorders>
+              <w:top w:val="single" w:sz="4" w:space="0" w:color="000000"/>
+              <w:left w:val="single" w:sz="4" w:space="0" w:color="000000"/>
+              <w:bottom w:val="single" w:sz="4" w:space="0" w:color="000000"/>
+              <w:right w:val="single" w:sz="4" w:space="0" w:color="000000"/>
+            </w:tcBorders>
+            <w:vAlign w:val="center"/>
+          </w:tcPr>
+          <w:p>
+            <w:pPr>
+              <w:keepNext/>
+              <w:spacing w:before="40" w:after="40"/>
+              <w:ind w:firstLine="0"/>
+              <w:jc w:val="center"/>
+            </w:pPr>
+            <w:r>
+              <w:rPr>
+                <w:sz w:val="22"/>
+                <w:szCs w:val="22"/>
+              </w:rPr>
+              <w:t>0</w:t>
+            </w:r>
+          </w:p>
+        </w:tc>
+        <w:tc>
+          <w:tcPr>
+            <w:tcW w:w="850" w:type="dxa"/>
+            <w:tcBorders>
+              <w:top w:val="single" w:sz="4" w:space="0" w:color="000000"/>
+              <w:left w:val="single" w:sz="4" w:space="0" w:color="000000"/>
+              <w:bottom w:val="single" w:sz="4" w:space="0" w:color="000000"/>
+              <w:right w:val="single" w:sz="4" w:space="0" w:color="000000"/>
+            </w:tcBorders>
+            <w:vAlign w:val="center"/>
+          </w:tcPr>
+          <w:p>
+            <w:pPr>
+              <w:keepNext/>
+              <w:spacing w:before="40" w:after="40"/>
+              <w:ind w:firstLine="0"/>
+              <w:jc w:val="center"/>
+            </w:pPr>
+            <w:r>
+              <w:rPr>
+                <w:sz w:val="22"/>
+                <w:szCs w:val="22"/>
+              </w:rPr>
+              <w:t>0</w:t>
+            </w:r>
+          </w:p>
+        </w:tc>
+        <w:tc>
+          <w:tcPr>
+            <w:tcW w:w="933" w:type="dxa"/>
+            <w:tcBorders>
+              <w:top w:val="single" w:sz="4" w:space="0" w:color="000000"/>
+              <w:left w:val="single" w:sz="4" w:space="0" w:color="000000"/>
+              <w:bottom w:val="single" w:sz="4" w:space="0" w:color="000000"/>
+              <w:right w:val="single" w:sz="4" w:space="0" w:color="000000"/>
+            </w:tcBorders>
+            <w:vAlign w:val="center"/>
+          </w:tcPr>
+          <w:p>
+            <w:pPr>
+              <w:keepNext/>
+              <w:spacing w:before="40" w:after="40"/>
+              <w:ind w:firstLine="0"/>
+              <w:jc w:val="center"/>
+            </w:pPr>
+            <w:r>
+              <w:rPr>
+                <w:sz w:val="22"/>
+                <w:szCs w:val="22"/>
+              </w:rPr>
+              <w:t>0</w:t>
+            </w:r>
+          </w:p>
+        </w:tc>
+        <w:tc>
+          <w:tcPr>
+            <w:tcW w:w="933" w:type="dxa"/>
+            <w:tcBorders>
+              <w:top w:val="single" w:sz="4" w:space="0" w:color="000000"/>
+              <w:left w:val="single" w:sz="4" w:space="0" w:color="000000"/>
+              <w:bottom w:val="single" w:sz="4" w:space="0" w:color="000000"/>
+              <w:right w:val="single" w:sz="4" w:space="0" w:color="000000"/>
+            </w:tcBorders>
+            <w:vAlign w:val="center"/>
+          </w:tcPr>
+          <w:p>
+            <w:pPr>
+              <w:keepNext/>
+              <w:spacing w:before="40" w:after="40"/>
+              <w:ind w:firstLine="0"/>
+              <w:jc w:val="center"/>
+            </w:pPr>
+            <w:r>
+              <w:rPr>
+                <w:sz w:val="22"/>
+                <w:szCs w:val="22"/>
+              </w:rPr>
+              <w:t>0</w:t>
+            </w:r>
+          </w:p>
+        </w:tc>
+        <w:tc>
+          <w:tcPr>
+            <w:tcW w:w="934" w:type="dxa"/>
+            <w:tcBorders>
+              <w:top w:val="single" w:sz="4" w:space="0" w:color="000000"/>
+              <w:left w:val="single" w:sz="4" w:space="0" w:color="000000"/>
+              <w:bottom w:val="single" w:sz="4" w:space="0" w:color="000000"/>
+              <w:right w:val="single" w:sz="4" w:space="0" w:color="000000"/>
+            </w:tcBorders>
+            <w:vAlign w:val="center"/>
+          </w:tcPr>
+          <w:p>
+            <w:pPr>
+              <w:keepNext/>
+              <w:spacing w:before="40" w:after="40"/>
+              <w:ind w:firstLine="0"/>
+              <w:jc w:val="center"/>
+            </w:pPr>
+            <w:r>
+              <w:rPr>
+                <w:sz w:val="22"/>
+                <w:szCs w:val="22"/>
+              </w:rPr>
+              <w:t>100</w:t>
+            </w:r>
+          </w:p>
+        </w:tc>
+      </w:tr>
+      <w:tr>
+        <w:trPr>
+          <w:cantSplit/>
+          <w:jc w:val="center"/>
+        </w:trPr>
+        <w:tc>
+          <w:tcPr>
+            <w:tcW w:w="1700" w:type="dxa"/>
+            <w:tcBorders>
+              <w:top w:val="single" w:sz="4" w:space="0" w:color="000000"/>
+              <w:left w:val="single" w:sz="4" w:space="0" w:color="000000"/>
+              <w:bottom w:val="single" w:sz="4" w:space="0" w:color="000000"/>
+              <w:right w:val="single" w:sz="4" w:space="0" w:color="000000"/>
+            </w:tcBorders>
+            <w:vAlign w:val="center"/>
+          </w:tcPr>
+          <w:p>
+            <w:pPr>
+              <w:keepNext/>
+              <w:spacing w:before="40" w:after="40"/>
+              <w:ind w:firstLine="0"/>
+              <w:jc w:val="left"/>
+            </w:pPr>
+            <w:r>
+              <w:rPr>
+                <w:sz w:val="22"/>
+                <w:szCs w:val="22"/>
+              </w:rPr>
+              <w:t>Чёрный</w:t>
+            </w:r>
+          </w:p>
+        </w:tc>
+        <w:tc>
+          <w:tcPr>
+            <w:tcW w:w="1738" w:type="dxa"/>
+            <w:tcBorders>
+              <w:top w:val="single" w:sz="4" w:space="0" w:color="000000"/>
+              <w:left w:val="single" w:sz="4" w:space="0" w:color="000000"/>
+              <w:bottom w:val="single" w:sz="4" w:space="0" w:color="000000"/>
+              <w:right w:val="single" w:sz="4" w:space="0" w:color="000000"/>
+            </w:tcBorders>
+            <w:vAlign w:val="center"/>
+          </w:tcPr>
+          <w:p>
+            <w:pPr>
+              <w:keepNext/>
+              <w:spacing w:before="40" w:after="40"/>
+              <w:ind w:firstLine="0"/>
+              <w:jc w:val="center"/>
+            </w:pPr>
+            <w:r>
+              <w:rPr>
+                <w:sz w:val="22"/>
+                <w:szCs w:val="22"/>
+              </w:rPr>
+              <w:t>0, 0, 0</w:t>
+            </w:r>
+          </w:p>
+        </w:tc>
+        <w:tc>
+          <w:tcPr>
+            <w:tcW w:w="850" w:type="dxa"/>
+            <w:tcBorders>
+              <w:top w:val="single" w:sz="4" w:space="0" w:color="000000"/>
+              <w:left w:val="single" w:sz="4" w:space="0" w:color="000000"/>
+              <w:bottom w:val="single" w:sz="4" w:space="0" w:color="000000"/>
+              <w:right w:val="single" w:sz="4" w:space="0" w:color="000000"/>
+            </w:tcBorders>
+            <w:vAlign w:val="center"/>
+          </w:tcPr>
+          <w:p>
+            <w:pPr>
+              <w:keepNext/>
+              <w:spacing w:before="40" w:after="40"/>
+              <w:ind w:firstLine="0"/>
+              <w:jc w:val="center"/>
+            </w:pPr>
+            <w:r>
+              <w:rPr>
+                <w:sz w:val="22"/>
+                <w:szCs w:val="22"/>
+              </w:rPr>
+              <w:t>0</w:t>
+            </w:r>
+          </w:p>
+        </w:tc>
+        <w:tc>
+          <w:tcPr>
+            <w:tcW w:w="850" w:type="dxa"/>
+            <w:tcBorders>
+              <w:top w:val="single" w:sz="4" w:space="0" w:color="000000"/>
+              <w:left w:val="single" w:sz="4" w:space="0" w:color="000000"/>
+              <w:bottom w:val="single" w:sz="4" w:space="0" w:color="000000"/>
+              <w:right w:val="single" w:sz="4" w:space="0" w:color="000000"/>
+            </w:tcBorders>
+            <w:vAlign w:val="center"/>
+          </w:tcPr>
+          <w:p>
+            <w:pPr>
+              <w:keepNext/>
+              <w:spacing w:before="40" w:after="40"/>
+              <w:ind w:firstLine="0"/>
+              <w:jc w:val="center"/>
+            </w:pPr>
+            <w:r>
+              <w:rPr>
+                <w:sz w:val="22"/>
+                <w:szCs w:val="22"/>
+              </w:rPr>
+              <w:t>0</w:t>
+            </w:r>
+          </w:p>
+        </w:tc>
+        <w:tc>
+          <w:tcPr>
+            <w:tcW w:w="850" w:type="dxa"/>
+            <w:tcBorders>
+              <w:top w:val="single" w:sz="4" w:space="0" w:color="000000"/>
+              <w:left w:val="single" w:sz="4" w:space="0" w:color="000000"/>
+              <w:bottom w:val="single" w:sz="4" w:space="0" w:color="000000"/>
+              <w:right w:val="single" w:sz="4" w:space="0" w:color="000000"/>
+            </w:tcBorders>
+            <w:vAlign w:val="center"/>
+          </w:tcPr>
+          <w:p>
+            <w:pPr>
+              <w:keepNext/>
+              <w:spacing w:before="40" w:after="40"/>
+              <w:ind w:firstLine="0"/>
+              <w:jc w:val="center"/>
+            </w:pPr>
+            <w:r>
+              <w:rPr>
+                <w:sz w:val="22"/>
+                <w:szCs w:val="22"/>
+              </w:rPr>
+              <w:t>0</w:t>
+            </w:r>
+          </w:p>
+        </w:tc>
+        <w:tc>
+          <w:tcPr>
+            <w:tcW w:w="850" w:type="dxa"/>
+            <w:tcBorders>
+              <w:top w:val="single" w:sz="4" w:space="0" w:color="000000"/>
+              <w:left w:val="single" w:sz="4" w:space="0" w:color="000000"/>
+              <w:bottom w:val="single" w:sz="4" w:space="0" w:color="000000"/>
+              <w:right w:val="single" w:sz="4" w:space="0" w:color="000000"/>
+            </w:tcBorders>
+            <w:vAlign w:val="center"/>
+          </w:tcPr>
+          <w:p>
+            <w:pPr>
+              <w:keepNext/>
+              <w:spacing w:before="40" w:after="40"/>
+              <w:ind w:firstLine="0"/>
+              <w:jc w:val="center"/>
+            </w:pPr>
+            <w:r>
+              <w:rPr>
+                <w:sz w:val="22"/>
+                <w:szCs w:val="22"/>
+              </w:rPr>
+              <w:t>100</w:t>
+            </w:r>
+          </w:p>
+        </w:tc>
+        <w:tc>
+          <w:tcPr>
+            <w:tcW w:w="933" w:type="dxa"/>
+            <w:tcBorders>
+              <w:top w:val="single" w:sz="4" w:space="0" w:color="000000"/>
+              <w:left w:val="single" w:sz="4" w:space="0" w:color="000000"/>
+              <w:bottom w:val="single" w:sz="4" w:space="0" w:color="000000"/>
+              <w:right w:val="single" w:sz="4" w:space="0" w:color="000000"/>
+            </w:tcBorders>
+            <w:vAlign w:val="center"/>
+          </w:tcPr>
+          <w:p>
+            <w:pPr>
+              <w:keepNext/>
+              <w:spacing w:before="40" w:after="40"/>
+              <w:ind w:firstLine="0"/>
+              <w:jc w:val="center"/>
+            </w:pPr>
+            <w:r>
+              <w:rPr>
+                <w:sz w:val="22"/>
+                <w:szCs w:val="22"/>
+              </w:rPr>
+              <w:t>0</w:t>
+            </w:r>
+          </w:p>
+        </w:tc>
+        <w:tc>
+          <w:tcPr>
+            <w:tcW w:w="933" w:type="dxa"/>
+            <w:tcBorders>
+              <w:top w:val="single" w:sz="4" w:space="0" w:color="000000"/>
+              <w:left w:val="single" w:sz="4" w:space="0" w:color="000000"/>
+              <w:bottom w:val="single" w:sz="4" w:space="0" w:color="000000"/>
+              <w:right w:val="single" w:sz="4" w:space="0" w:color="000000"/>
+            </w:tcBorders>
+            <w:vAlign w:val="center"/>
+          </w:tcPr>
+          <w:p>
+            <w:pPr>
+              <w:keepNext/>
+              <w:spacing w:before="40" w:after="40"/>
+              <w:ind w:firstLine="0"/>
+              <w:jc w:val="center"/>
+            </w:pPr>
+            <w:r>
+              <w:rPr>
+                <w:sz w:val="22"/>
+                <w:szCs w:val="22"/>
+              </w:rPr>
+              <w:t>0</w:t>
+            </w:r>
+          </w:p>
+        </w:tc>
+        <w:tc>
+          <w:tcPr>
+            <w:tcW w:w="934" w:type="dxa"/>
+            <w:tcBorders>
+              <w:top w:val="single" w:sz="4" w:space="0" w:color="000000"/>
+              <w:left w:val="single" w:sz="4" w:space="0" w:color="000000"/>
+              <w:bottom w:val="single" w:sz="4" w:space="0" w:color="000000"/>
+              <w:right w:val="single" w:sz="4" w:space="0" w:color="000000"/>
+            </w:tcBorders>
+            <w:vAlign w:val="center"/>
+          </w:tcPr>
+          <w:p>
+            <w:pPr>
+              <w:keepNext/>
+              <w:spacing w:before="40" w:after="40"/>
+              <w:ind w:firstLine="0"/>
+              <w:jc w:val="center"/>
+            </w:pPr>
+            <w:r>
+              <w:rPr>
+                <w:sz w:val="22"/>
+                <w:szCs w:val="22"/>
+              </w:rPr>
+              <w:t>0</w:t>
+            </w:r>
+          </w:p>
+        </w:tc>
+      </w:tr>
+      <w:tr>
+        <w:trPr>
+          <w:cantSplit/>
+          <w:jc w:val="center"/>
+        </w:trPr>
+        <w:tc>
+          <w:tcPr>
+            <w:tcW w:w="1700" w:type="dxa"/>
+            <w:tcBorders>
+              <w:top w:val="single" w:sz="4" w:space="0" w:color="000000"/>
+              <w:left w:val="single" w:sz="4" w:space="0" w:color="000000"/>
+              <w:bottom w:val="single" w:sz="4" w:space="0" w:color="000000"/>
+              <w:right w:val="single" w:sz="4" w:space="0" w:color="000000"/>
+            </w:tcBorders>
+            <w:vAlign w:val="center"/>
+          </w:tcPr>
+          <w:p>
+            <w:pPr>
+              <w:keepNext/>
+              <w:spacing w:before="40" w:after="40"/>
+              <w:ind w:firstLine="0"/>
+              <w:jc w:val="left"/>
+            </w:pPr>
+            <w:r>
+              <w:rPr>
+                <w:sz w:val="22"/>
+                <w:szCs w:val="22"/>
+              </w:rPr>
+              <w:t>Серый</w:t>
+            </w:r>
+          </w:p>
+        </w:tc>
+        <w:tc>
+          <w:tcPr>
+            <w:tcW w:w="1738" w:type="dxa"/>
+            <w:tcBorders>
+              <w:top w:val="single" w:sz="4" w:space="0" w:color="000000"/>
+              <w:left w:val="single" w:sz="4" w:space="0" w:color="000000"/>
+              <w:bottom w:val="single" w:sz="4" w:space="0" w:color="000000"/>
+              <w:right w:val="single" w:sz="4" w:space="0" w:color="000000"/>
+            </w:tcBorders>
+            <w:vAlign w:val="center"/>
+          </w:tcPr>
+          <w:p>
+            <w:pPr>
+              <w:keepNext/>
+              <w:spacing w:before="40" w:after="40"/>
+              <w:ind w:firstLine="0"/>
+              <w:jc w:val="center"/>
+            </w:pPr>
+            <w:r>
+              <w:rPr>
+                <w:sz w:val="22"/>
+                <w:szCs w:val="22"/>
+              </w:rPr>
+              <w:t>128, 128, 128</w:t>
+            </w:r>
+          </w:p>
+        </w:tc>
+        <w:tc>
+          <w:tcPr>
+            <w:tcW w:w="850" w:type="dxa"/>
+            <w:tcBorders>
+              <w:top w:val="single" w:sz="4" w:space="0" w:color="000000"/>
+              <w:left w:val="single" w:sz="4" w:space="0" w:color="000000"/>
+              <w:bottom w:val="single" w:sz="4" w:space="0" w:color="000000"/>
+              <w:right w:val="single" w:sz="4" w:space="0" w:color="000000"/>
+            </w:tcBorders>
+            <w:vAlign w:val="center"/>
+          </w:tcPr>
+          <w:p>
+            <w:pPr>
+              <w:keepNext/>
+              <w:spacing w:before="40" w:after="40"/>
+              <w:ind w:firstLine="0"/>
+              <w:jc w:val="center"/>
+            </w:pPr>
+            <w:r>
+              <w:rPr>
+                <w:sz w:val="22"/>
+                <w:szCs w:val="22"/>
+              </w:rPr>
+              <w:t>0</w:t>
+            </w:r>
+          </w:p>
+        </w:tc>
+        <w:tc>
+          <w:tcPr>
+            <w:tcW w:w="850" w:type="dxa"/>
+            <w:tcBorders>
+              <w:top w:val="single" w:sz="4" w:space="0" w:color="000000"/>
+              <w:left w:val="single" w:sz="4" w:space="0" w:color="000000"/>
+              <w:bottom w:val="single" w:sz="4" w:space="0" w:color="000000"/>
+              <w:right w:val="single" w:sz="4" w:space="0" w:color="000000"/>
+            </w:tcBorders>
+            <w:vAlign w:val="center"/>
+          </w:tcPr>
+          <w:p>
+            <w:pPr>
+              <w:keepNext/>
+              <w:spacing w:before="40" w:after="40"/>
+              <w:ind w:firstLine="0"/>
+              <w:jc w:val="center"/>
+            </w:pPr>
+            <w:r>
+              <w:rPr>
+                <w:sz w:val="22"/>
+                <w:szCs w:val="22"/>
+              </w:rPr>
+              <w:t>0</w:t>
+            </w:r>
+          </w:p>
+        </w:tc>
+        <w:tc>
+          <w:tcPr>
+            <w:tcW w:w="850" w:type="dxa"/>
+            <w:tcBorders>
+              <w:top w:val="single" w:sz="4" w:space="0" w:color="000000"/>
+              <w:left w:val="single" w:sz="4" w:space="0" w:color="000000"/>
+              <w:bottom w:val="single" w:sz="4" w:space="0" w:color="000000"/>
+              <w:right w:val="single" w:sz="4" w:space="0" w:color="000000"/>
+            </w:tcBorders>
+            <w:vAlign w:val="center"/>
+          </w:tcPr>
+          <w:p>
+            <w:pPr>
+              <w:keepNext/>
+              <w:spacing w:before="40" w:after="40"/>
+              <w:ind w:firstLine="0"/>
+              <w:jc w:val="center"/>
+            </w:pPr>
+            <w:r>
+              <w:rPr>
+                <w:sz w:val="22"/>
+                <w:szCs w:val="22"/>
+              </w:rPr>
+              <w:t>0</w:t>
+            </w:r>
+          </w:p>
+        </w:tc>
+        <w:tc>
+          <w:tcPr>
+            <w:tcW w:w="850" w:type="dxa"/>
+            <w:tcBorders>
+              <w:top w:val="single" w:sz="4" w:space="0" w:color="000000"/>
+              <w:left w:val="single" w:sz="4" w:space="0" w:color="000000"/>
+              <w:bottom w:val="single" w:sz="4" w:space="0" w:color="000000"/>
+              <w:right w:val="single" w:sz="4" w:space="0" w:color="000000"/>
+            </w:tcBorders>
+            <w:vAlign w:val="center"/>
+          </w:tcPr>
+          <w:p>
+            <w:pPr>
+              <w:keepNext/>
+              <w:spacing w:before="40" w:after="40"/>
+              <w:ind w:firstLine="0"/>
+              <w:jc w:val="center"/>
+            </w:pPr>
+            <w:r>
+              <w:rPr>
+                <w:sz w:val="22"/>
+                <w:szCs w:val="22"/>
+              </w:rPr>
+              <w:t>49,8</w:t>
+            </w:r>
+          </w:p>
+        </w:tc>
+        <w:tc>
+          <w:tcPr>
+            <w:tcW w:w="933" w:type="dxa"/>
+            <w:tcBorders>
+              <w:top w:val="single" w:sz="4" w:space="0" w:color="000000"/>
+              <w:left w:val="single" w:sz="4" w:space="0" w:color="000000"/>
+              <w:bottom w:val="single" w:sz="4" w:space="0" w:color="000000"/>
+              <w:right w:val="single" w:sz="4" w:space="0" w:color="000000"/>
+            </w:tcBorders>
+            <w:vAlign w:val="center"/>
+          </w:tcPr>
+          <w:p>
+            <w:pPr>
+              <w:keepNext/>
+              <w:spacing w:before="40" w:after="40"/>
+              <w:ind w:firstLine="0"/>
+              <w:jc w:val="center"/>
+            </w:pPr>
+            <w:r>
+              <w:rPr>
+                <w:sz w:val="22"/>
+                <w:szCs w:val="22"/>
+              </w:rPr>
+              <w:t>0</w:t>
+            </w:r>
+          </w:p>
+        </w:tc>
+        <w:tc>
+          <w:tcPr>
+            <w:tcW w:w="933" w:type="dxa"/>
+            <w:tcBorders>
+              <w:top w:val="single" w:sz="4" w:space="0" w:color="000000"/>
+              <w:left w:val="single" w:sz="4" w:space="0" w:color="000000"/>
+              <w:bottom w:val="single" w:sz="4" w:space="0" w:color="000000"/>
+              <w:right w:val="single" w:sz="4" w:space="0" w:color="000000"/>
+            </w:tcBorders>
+            <w:vAlign w:val="center"/>
+          </w:tcPr>
+          <w:p>
+            <w:pPr>
+              <w:keepNext/>
+              <w:spacing w:before="40" w:after="40"/>
+              <w:ind w:firstLine="0"/>
+              <w:jc w:val="center"/>
+            </w:pPr>
+            <w:r>
+              <w:rPr>
+                <w:sz w:val="22"/>
+                <w:szCs w:val="22"/>
+              </w:rPr>
+              <w:t>0</w:t>
+            </w:r>
+          </w:p>
+        </w:tc>
+        <w:tc>
+          <w:tcPr>
+            <w:tcW w:w="934" w:type="dxa"/>
+            <w:tcBorders>
+              <w:top w:val="single" w:sz="4" w:space="0" w:color="000000"/>
+              <w:left w:val="single" w:sz="4" w:space="0" w:color="000000"/>
+              <w:bottom w:val="single" w:sz="4" w:space="0" w:color="000000"/>
+              <w:right w:val="single" w:sz="4" w:space="0" w:color="000000"/>
+            </w:tcBorders>
+            <w:vAlign w:val="center"/>
+          </w:tcPr>
+          <w:p>
+            <w:pPr>
+              <w:keepNext/>
+              <w:spacing w:before="40" w:after="40"/>
+              <w:ind w:firstLine="0"/>
+              <w:jc w:val="center"/>
+            </w:pPr>
+            <w:r>
+              <w:rPr>
+                <w:sz w:val="22"/>
+                <w:szCs w:val="22"/>
+              </w:rPr>
+              <w:t>50,2</w:t>
+            </w:r>
+          </w:p>
+        </w:tc>
+      </w:tr>
+      <w:tr>
+        <w:trPr>
+          <w:cantSplit/>
+          <w:jc w:val="center"/>
+        </w:trPr>
+        <w:tc>
+          <w:tcPr>
+            <w:tcW w:w="1700" w:type="dxa"/>
+            <w:tcBorders>
+              <w:top w:val="single" w:sz="4" w:space="0" w:color="000000"/>
+              <w:left w:val="single" w:sz="4" w:space="0" w:color="000000"/>
+              <w:bottom w:val="single" w:sz="4" w:space="0" w:color="000000"/>
+              <w:right w:val="single" w:sz="4" w:space="0" w:color="000000"/>
+            </w:tcBorders>
+            <w:vAlign w:val="center"/>
+          </w:tcPr>
+          <w:p>
+            <w:pPr>
+              <w:keepNext/>
+              <w:spacing w:before="40" w:after="40"/>
+              <w:ind w:firstLine="0"/>
+              <w:jc w:val="left"/>
+            </w:pPr>
+            <w:r>
+              <w:rPr>
+                <w:sz w:val="22"/>
+                <w:szCs w:val="22"/>
+              </w:rPr>
+              <w:t>Произвольный</w:t>
+            </w:r>
+          </w:p>
+        </w:tc>
+        <w:tc>
+          <w:tcPr>
+            <w:tcW w:w="1738" w:type="dxa"/>
+            <w:tcBorders>
+              <w:top w:val="single" w:sz="4" w:space="0" w:color="000000"/>
+              <w:left w:val="single" w:sz="4" w:space="0" w:color="000000"/>
+              <w:bottom w:val="single" w:sz="4" w:space="0" w:color="000000"/>
+              <w:right w:val="single" w:sz="4" w:space="0" w:color="000000"/>
+            </w:tcBorders>
+            <w:vAlign w:val="center"/>
+          </w:tcPr>
+          <w:p>
+            <w:pPr>
+              <w:keepNext/>
+              <w:spacing w:before="40" w:after="40"/>
+              <w:ind w:firstLine="0"/>
+              <w:jc w:val="center"/>
+            </w:pPr>
+            <w:r>
+              <w:rPr>
+                <w:sz w:val="22"/>
+                <w:szCs w:val="22"/>
+              </w:rPr>
+              <w:t>200, 100, 50</w:t>
+            </w:r>
+          </w:p>
+        </w:tc>
+        <w:tc>
+          <w:tcPr>
+            <w:tcW w:w="850" w:type="dxa"/>
+            <w:tcBorders>
+              <w:top w:val="single" w:sz="4" w:space="0" w:color="000000"/>
+              <w:left w:val="single" w:sz="4" w:space="0" w:color="000000"/>
+              <w:bottom w:val="single" w:sz="4" w:space="0" w:color="000000"/>
+              <w:right w:val="single" w:sz="4" w:space="0" w:color="000000"/>
+            </w:tcBorders>
+            <w:vAlign w:val="center"/>
+          </w:tcPr>
+          <w:p>
+            <w:pPr>
+              <w:keepNext/>
+              <w:spacing w:before="40" w:after="40"/>
+              <w:ind w:firstLine="0"/>
+              <w:jc w:val="center"/>
+            </w:pPr>
+            <w:r>
+              <w:rPr>
+                <w:sz w:val="22"/>
+                <w:szCs w:val="22"/>
+              </w:rPr>
+              <w:t>0</w:t>
+            </w:r>
+          </w:p>
+        </w:tc>
+        <w:tc>
+          <w:tcPr>
+            <w:tcW w:w="850" w:type="dxa"/>
+            <w:tcBorders>
+              <w:top w:val="single" w:sz="4" w:space="0" w:color="000000"/>
+              <w:left w:val="single" w:sz="4" w:space="0" w:color="000000"/>
+              <w:bottom w:val="single" w:sz="4" w:space="0" w:color="000000"/>
+              <w:right w:val="single" w:sz="4" w:space="0" w:color="000000"/>
+            </w:tcBorders>
+            <w:vAlign w:val="center"/>
+          </w:tcPr>
+          <w:p>
+            <w:pPr>
+              <w:keepNext/>
+              <w:spacing w:before="40" w:after="40"/>
+              <w:ind w:firstLine="0"/>
+              <w:jc w:val="center"/>
+            </w:pPr>
+            <w:r>
+              <w:rPr>
+                <w:sz w:val="22"/>
+                <w:szCs w:val="22"/>
+              </w:rPr>
+              <w:t>50</w:t>
+            </w:r>
+          </w:p>
+        </w:tc>
+        <w:tc>
+          <w:tcPr>
+            <w:tcW w:w="850" w:type="dxa"/>
+            <w:tcBorders>
+              <w:top w:val="single" w:sz="4" w:space="0" w:color="000000"/>
+              <w:left w:val="single" w:sz="4" w:space="0" w:color="000000"/>
+              <w:bottom w:val="single" w:sz="4" w:space="0" w:color="000000"/>
+              <w:right w:val="single" w:sz="4" w:space="0" w:color="000000"/>
+            </w:tcBorders>
+            <w:vAlign w:val="center"/>
+          </w:tcPr>
+          <w:p>
+            <w:pPr>
+              <w:keepNext/>
+              <w:spacing w:before="40" w:after="40"/>
+              <w:ind w:firstLine="0"/>
+              <w:jc w:val="center"/>
+            </w:pPr>
+            <w:r>
+              <w:rPr>
+                <w:sz w:val="22"/>
+                <w:szCs w:val="22"/>
+              </w:rPr>
+              <w:t>75</w:t>
+            </w:r>
+          </w:p>
+        </w:tc>
+        <w:tc>
+          <w:tcPr>
+            <w:tcW w:w="850" w:type="dxa"/>
+            <w:tcBorders>
+              <w:top w:val="single" w:sz="4" w:space="0" w:color="000000"/>
+              <w:left w:val="single" w:sz="4" w:space="0" w:color="000000"/>
+              <w:bottom w:val="single" w:sz="4" w:space="0" w:color="000000"/>
+              <w:right w:val="single" w:sz="4" w:space="0" w:color="000000"/>
+            </w:tcBorders>
+            <w:vAlign w:val="center"/>
+          </w:tcPr>
+          <w:p>
+            <w:pPr>
+              <w:keepNext/>
+              <w:spacing w:before="40" w:after="40"/>
+              <w:ind w:firstLine="0"/>
+              <w:jc w:val="center"/>
+            </w:pPr>
+            <w:r>
+              <w:rPr>
+                <w:sz w:val="22"/>
+                <w:szCs w:val="22"/>
+              </w:rPr>
+              <w:t>21,6</w:t>
+            </w:r>
+          </w:p>
+        </w:tc>
+        <w:tc>
+          <w:tcPr>
+            <w:tcW w:w="933" w:type="dxa"/>
+            <w:tcBorders>
+              <w:top w:val="single" w:sz="4" w:space="0" w:color="000000"/>
+              <w:left w:val="single" w:sz="4" w:space="0" w:color="000000"/>
+              <w:bottom w:val="single" w:sz="4" w:space="0" w:color="000000"/>
+              <w:right w:val="single" w:sz="4" w:space="0" w:color="000000"/>
+            </w:tcBorders>
+            <w:vAlign w:val="center"/>
+          </w:tcPr>
+          <w:p>
+            <w:pPr>
+              <w:keepNext/>
+              <w:spacing w:before="40" w:after="40"/>
+              <w:ind w:firstLine="0"/>
+              <w:jc w:val="center"/>
+            </w:pPr>
+            <w:r>
+              <w:rPr>
+                <w:sz w:val="22"/>
+                <w:szCs w:val="22"/>
+              </w:rPr>
+              <w:t>20</w:t>
+            </w:r>
+          </w:p>
+        </w:tc>
+        <w:tc>
+          <w:tcPr>
+            <w:tcW w:w="933" w:type="dxa"/>
+            <w:tcBorders>
+              <w:top w:val="single" w:sz="4" w:space="0" w:color="000000"/>
+              <w:left w:val="single" w:sz="4" w:space="0" w:color="000000"/>
+              <w:bottom w:val="single" w:sz="4" w:space="0" w:color="000000"/>
+              <w:right w:val="single" w:sz="4" w:space="0" w:color="000000"/>
+            </w:tcBorders>
+            <w:vAlign w:val="center"/>
+          </w:tcPr>
+          <w:p>
+            <w:pPr>
+              <w:keepNext/>
+              <w:spacing w:before="40" w:after="40"/>
+              <w:ind w:firstLine="0"/>
+              <w:jc w:val="center"/>
+            </w:pPr>
+            <w:r>
+              <w:rPr>
+                <w:sz w:val="22"/>
+                <w:szCs w:val="22"/>
+              </w:rPr>
+              <w:t>60</w:t>
+            </w:r>
+          </w:p>
+        </w:tc>
+        <w:tc>
+          <w:tcPr>
+            <w:tcW w:w="934" w:type="dxa"/>
+            <w:tcBorders>
+              <w:top w:val="single" w:sz="4" w:space="0" w:color="000000"/>
+              <w:left w:val="single" w:sz="4" w:space="0" w:color="000000"/>
+              <w:bottom w:val="single" w:sz="4" w:space="0" w:color="000000"/>
+              <w:right w:val="single" w:sz="4" w:space="0" w:color="000000"/>
+            </w:tcBorders>
+            <w:vAlign w:val="center"/>
+          </w:tcPr>
+          <w:p>
+            <w:pPr>
+              <w:keepNext/>
+              <w:spacing w:before="40" w:after="40"/>
+              <w:ind w:firstLine="0"/>
+              <w:jc w:val="center"/>
+            </w:pPr>
+            <w:r>
+              <w:rPr>
+                <w:sz w:val="22"/>
+                <w:szCs w:val="22"/>
+              </w:rPr>
+              <w:t>49</w:t>
+            </w:r>
+          </w:p>
+        </w:tc>
+      </w:tr>
+    </w:tbl>
+    <w:p>
+      <w:pPr>
+        <w:ind w:firstLine="0"/>
+      </w:pPr>
+    </w:p>
+    <w:p>
+      <w:pPr>
+        <w:jc w:val="center"/>
+      </w:pPr>
+      <w:r>
+        <w:rPr>
+          <w:noProof/>
+        </w:rPr>
         <w:drawing>
-          <wp:inline distT="0" distB="0" distL="0" distR="0" wp14:anchorId="5AEBEA24" wp14:editId="4AEE9996">
+          <wp:inline distT="0" distB="0" distL="0" distR="0" wp14:anchorId="1BD71A32" wp14:editId="2614A42B">
             <wp:extent cx="4450080" cy="3753803"/>
             <wp:effectExtent l="0" t="0" r="7620" b="0"/>
             <wp:docPr id="7" name="Рисунок 7"/>
@@ -1005,7 +3044,7 @@
     </w:p>
     <w:p>
       <w:r>
-        <w:t>Белый, чёрный и серый цвета проверяют особые случаи: у них H и S не определены (раздел 2.3). Основные цвета проходят все три ветви формулы тона (max = R, G или B).</w:t>
+        <w:t>Белый, чёрный и серый цвета проверяют особые случаи: у них H и S не определены (раздел 2.2). Основные цвета проходят все три ветви формулы тона (max = R, G или B).</w:t>
       </w:r>
     </w:p>
     <w:p>
@@ -1013,13 +3052,8 @@
         <w:pStyle w:val="2"/>
       </w:pPr>
       <w:r>
-        <w:t>2.</w:t>
-      </w:r>
-      <w:r>
-        <w:t>2</w:t>
-      </w:r>
-      <w:r>
-        <w:t xml:space="preserve"> Крайние случаи</w:t>
+        <w:lastRenderedPageBreak/>
+        <w:t>2.2 Крайние случаи</w:t>
       </w:r>
     </w:p>
     <w:p>
@@ -1034,11 +3068,7 @@
     </w:p>
     <w:p>
       <w:r>
-        <w:t xml:space="preserve">Серый, белый и чёрный цвета (R = G = B). Для них max = min, поэтому d = 0: тон H не определён, а S = 0. Функция to_hls возвращает H = 0, S = 0, а в окне </w:t>
-      </w:r>
-      <w:r>
-        <w:lastRenderedPageBreak/>
-        <w:t>программа оставляет последние известные H и S, чтобы значения не прыгали в ноль (рисунок 6). Сам цвет и значение L при этом не меняются.</w:t>
+        <w:t>Серый, белый и чёрный цвета (R = G = B). Для них max = min, поэтому d = 0: тон H не определён, а S = 0. Функция to_hls возвращает H = 0, S = 0, а в окне программа оставляет последние известные H и S, чтобы значения не прыгали в ноль (рисунок 6). Сам цвет и значение L при этом не меняются.</w:t>
       </w:r>
     </w:p>
     <w:p>
@@ -1054,8 +3084,11 @@
         <w:jc w:val="center"/>
       </w:pPr>
       <w:r>
+        <w:rPr>
+          <w:noProof/>
+        </w:rPr>
         <w:drawing>
-          <wp:inline distT="0" distB="0" distL="0" distR="0" wp14:anchorId="3384C58D" wp14:editId="77C602E2">
+          <wp:inline distT="0" distB="0" distL="0" distR="0" wp14:anchorId="00EABB59" wp14:editId="482201E0">
             <wp:extent cx="3741420" cy="3215028"/>
             <wp:effectExtent l="0" t="0" r="0" b="0"/>
             <wp:docPr id="6" name="Рисунок 6"/>
@@ -1110,21 +3143,160 @@
       </w:r>
     </w:p>
     <w:p>
-      <w:r>
-        <w:t>В ходе лабораторной работы я изучил цветовые модели RGB, CMYK и HLS: их каналы, диапазоны значений и области применения, а также математические преобразования между ними. На практике я разобрался, чем аддитивная модель RGB отличается от субтрактивной CMYK и почему HLS удобнее для описания цвета так, как его воспринимает человек (тон, насыщенность, светлота). Выяснилось, что прямых формул между CMYK и HLS нет, и эти пары приходится считать через RGB. Также я увидел, что преобразование между моделями не всегда однозначно: один и тот же цвет в RGB можно представить разными наборами CMYK, а для серых оттенков тон H не определён.</w:t>
-      </w:r>
-      <w:r>
-        <w:t xml:space="preserve"> </w:t>
-      </w:r>
-      <w:r>
-        <w:t>Разработа</w:t>
-      </w:r>
-      <w:r>
-        <w:t>л</w:t>
-      </w:r>
-      <w:r>
-        <w:t xml:space="preserve"> приложение на Python с использованием Tkinter. Оно позволяет задавать цвет тремя способами (ввод в поля, ползунки, системная палитра) и сразу показывает его составляющие во всех трёх моделях. Я получил навыки построения графического интерфейса и связывания элементов управления между собой.</w:t>
-      </w:r>
+      <w:pPr>
+        <w:rPr>
+          <w:lang w:val="ru-BY"/>
+        </w:rPr>
+      </w:pPr>
+      <w:r>
+        <w:rPr>
+          <w:lang w:val="ru-BY"/>
+        </w:rPr>
+        <w:t>В ходе лабораторной работы были реализованы преобразования между моделями RGB, CMYK и HLS и разработано приложение для интерактивной работы с цветом. По результатам работы можно сделать следующие выводы:</w:t>
+      </w:r>
+    </w:p>
+    <w:p>
+      <w:pPr>
+        <w:numPr>
+          <w:ilvl w:val="0"/>
+          <w:numId w:val="14"/>
+        </w:numPr>
+        <w:rPr>
+          <w:lang w:val="ru-BY"/>
+        </w:rPr>
+      </w:pPr>
+      <w:r>
+        <w:rPr>
+          <w:lang w:val="ru-BY"/>
+        </w:rPr>
+        <w:t xml:space="preserve">Прямых формул между CMYK и HLS не существует, поэтому эти пары считаются через RGB (CMYK </w:t>
+      </w:r>
+      <w:r>
+        <w:rPr>
+          <w:lang w:val="ru-BY"/>
+        </w:rPr>
+        <w:t xml:space="preserve">-&gt; </w:t>
+      </w:r>
+      <w:r>
+        <w:rPr>
+          <w:lang w:val="ru-BY"/>
+        </w:rPr>
+        <w:t xml:space="preserve">RGB </w:t>
+      </w:r>
+      <w:r>
+        <w:rPr>
+          <w:lang w:val="ru-BY"/>
+        </w:rPr>
+        <w:t xml:space="preserve">-&gt; </w:t>
+      </w:r>
+      <w:r>
+        <w:rPr>
+          <w:lang w:val="ru-BY"/>
+        </w:rPr>
+        <w:t>HLS и обратно). Это позволило ограничиться четырьмя базовыми преобразованиями вместо шести, а в коде вынести их в три класса: RGBModel, CMYKModel и HLSModel.</w:t>
+      </w:r>
+    </w:p>
+    <w:p>
+      <w:pPr>
+        <w:numPr>
+          <w:ilvl w:val="0"/>
+          <w:numId w:val="14"/>
+        </w:numPr>
+        <w:rPr>
+          <w:lang w:val="ru-BY"/>
+        </w:rPr>
+      </w:pPr>
+      <w:r>
+        <w:rPr>
+          <w:lang w:val="ru-BY"/>
+        </w:rPr>
+        <w:t>Формулы преобразований нельзя применять «в лоб»: для каждой есть вырожденные случаи. У чёрного цвета K = 1, и знаменатель 1 − K в формулах C, M, Y обращается в ноль. Для этого случая пришлось предусмотреть отдельную ветку, которая возвращает C = M = Y = 0, K = 1.</w:t>
+      </w:r>
+    </w:p>
+    <w:p>
+      <w:pPr>
+        <w:numPr>
+          <w:ilvl w:val="0"/>
+          <w:numId w:val="14"/>
+        </w:numPr>
+        <w:rPr>
+          <w:lang w:val="ru-BY"/>
+        </w:rPr>
+      </w:pPr>
+      <w:r>
+        <w:rPr>
+          <w:lang w:val="ru-BY"/>
+        </w:rPr>
+        <w:t>Для серых оттенков (R = G = B) тон H не определён, так как max = min и d = 0. Функция to_hls в этом случае возвращает H = 0, S = 0. Если выводить эти значения как есть, при движении ползунка через серый цвет H и S скачут в ноль. Поэтому в окне приложения сохраняются последние известные H и S, а сам цвет и L не меняются.</w:t>
+      </w:r>
+    </w:p>
+    <w:p>
+      <w:pPr>
+        <w:numPr>
+          <w:ilvl w:val="0"/>
+          <w:numId w:val="14"/>
+        </w:numPr>
+        <w:rPr>
+          <w:lang w:val="ru-BY"/>
+        </w:rPr>
+      </w:pPr>
+      <w:r>
+        <w:rPr>
+          <w:lang w:val="ru-BY"/>
+        </w:rPr>
+        <w:t>Формулы RGB</w:t>
+      </w:r>
+      <w:r>
+        <w:rPr>
+          <w:lang w:val="ru-BY"/>
+        </w:rPr>
+        <w:t xml:space="preserve"> -</w:t>
+      </w:r>
+      <w:r>
+        <w:t>&gt;</w:t>
+      </w:r>
+      <w:r>
+        <w:rPr>
+          <w:lang w:val="ru-BY"/>
+        </w:rPr>
+        <w:t xml:space="preserve"> HLS содержат ветвления, и это нужно учитывать при проверке. Насыщенность считается по разным формулам при L &lt; 0,5 и L ≥ 0,5, а тон — по тому, какой канал максимален. Поэтому тестовый набор должен покрывать все три ветви: красный, зелёный и синий проходят max = R, G и B соответственно.</w:t>
+      </w:r>
+    </w:p>
+    <w:p>
+      <w:pPr>
+        <w:numPr>
+          <w:ilvl w:val="0"/>
+          <w:numId w:val="14"/>
+        </w:numPr>
+        <w:rPr>
+          <w:lang w:val="ru-BY"/>
+        </w:rPr>
+      </w:pPr>
+      <w:r>
+        <w:rPr>
+          <w:lang w:val="ru-BY"/>
+        </w:rPr>
+        <w:t xml:space="preserve">При обратном преобразовании HLS </w:t>
+      </w:r>
+      <w:r>
+        <w:rPr>
+          <w:lang w:val="ru-BY"/>
+        </w:rPr>
+        <w:t xml:space="preserve">-&gt; </w:t>
+      </w:r>
+      <w:r>
+        <w:rPr>
+          <w:lang w:val="ru-BY"/>
+        </w:rPr>
+        <w:t>RGB результат нужно округлять и ограничивать диапазоном 0…255, иначе возможны значения вне диапазона. Каналы считаются одной вспомогательной функцией _value с подстановкой H + 120°, H и H − 120°, что избавляет от трёх копий одного кода.</w:t>
+      </w:r>
+    </w:p>
+    <w:p>
+      <w:pPr>
+        <w:rPr>
+          <w:lang w:val="ru-BY"/>
+        </w:rPr>
+      </w:pPr>
     </w:p>
     <w:sectPr>
       <w:footerReference w:type="default" r:id="rId15"/>
@@ -1859,6 +4031,119 @@
       <w:lvlJc w:val="left"/>
       <w:pPr>
         <w:ind w:left="851" w:hanging="425"/>
+      </w:pPr>
+    </w:lvl>
+  </w:abstractNum>
+  <w:abstractNum w:abstractNumId="8" w15:restartNumberingAfterBreak="0">
+    <w:nsid w:val="759F2C17"/>
+    <w:multiLevelType w:val="multilevel"/>
+    <w:tmpl w:val="6310C0E4"/>
+    <w:lvl w:ilvl="0">
+      <w:start w:val="1"/>
+      <w:numFmt w:val="decimal"/>
+      <w:lvlText w:val="%1."/>
+      <w:lvlJc w:val="left"/>
+      <w:pPr>
+        <w:tabs>
+          <w:tab w:val="num" w:pos="720"/>
+        </w:tabs>
+        <w:ind w:left="720" w:hanging="360"/>
+      </w:pPr>
+    </w:lvl>
+    <w:lvl w:ilvl="1" w:tentative="1">
+      <w:start w:val="1"/>
+      <w:numFmt w:val="decimal"/>
+      <w:lvlText w:val="%2."/>
+      <w:lvlJc w:val="left"/>
+      <w:pPr>
+        <w:tabs>
+          <w:tab w:val="num" w:pos="1440"/>
+        </w:tabs>
+        <w:ind w:left="1440" w:hanging="360"/>
+      </w:pPr>
+    </w:lvl>
+    <w:lvl w:ilvl="2" w:tentative="1">
+      <w:start w:val="1"/>
+      <w:numFmt w:val="decimal"/>
+      <w:lvlText w:val="%3."/>
+      <w:lvlJc w:val="left"/>
+      <w:pPr>
+        <w:tabs>
+          <w:tab w:val="num" w:pos="2160"/>
+        </w:tabs>
+        <w:ind w:left="2160" w:hanging="360"/>
+      </w:pPr>
+    </w:lvl>
+    <w:lvl w:ilvl="3" w:tentative="1">
+      <w:start w:val="1"/>
+      <w:numFmt w:val="decimal"/>
+      <w:lvlText w:val="%4."/>
+      <w:lvlJc w:val="left"/>
+      <w:pPr>
+        <w:tabs>
+          <w:tab w:val="num" w:pos="2880"/>
+        </w:tabs>
+        <w:ind w:left="2880" w:hanging="360"/>
+      </w:pPr>
+    </w:lvl>
+    <w:lvl w:ilvl="4" w:tentative="1">
+      <w:start w:val="1"/>
+      <w:numFmt w:val="decimal"/>
+      <w:lvlText w:val="%5."/>
+      <w:lvlJc w:val="left"/>
+      <w:pPr>
+        <w:tabs>
+          <w:tab w:val="num" w:pos="3600"/>
+        </w:tabs>
+        <w:ind w:left="3600" w:hanging="360"/>
+      </w:pPr>
+    </w:lvl>
+    <w:lvl w:ilvl="5" w:tentative="1">
+      <w:start w:val="1"/>
+      <w:numFmt w:val="decimal"/>
+      <w:lvlText w:val="%6."/>
+      <w:lvlJc w:val="left"/>
+      <w:pPr>
+        <w:tabs>
+          <w:tab w:val="num" w:pos="4320"/>
+        </w:tabs>
+        <w:ind w:left="4320" w:hanging="360"/>
+      </w:pPr>
+    </w:lvl>
+    <w:lvl w:ilvl="6" w:tentative="1">
+      <w:start w:val="1"/>
+      <w:numFmt w:val="decimal"/>
+      <w:lvlText w:val="%7."/>
+      <w:lvlJc w:val="left"/>
+      <w:pPr>
+        <w:tabs>
+          <w:tab w:val="num" w:pos="5040"/>
+        </w:tabs>
+        <w:ind w:left="5040" w:hanging="360"/>
+      </w:pPr>
+    </w:lvl>
+    <w:lvl w:ilvl="7" w:tentative="1">
+      <w:start w:val="1"/>
+      <w:numFmt w:val="decimal"/>
+      <w:lvlText w:val="%8."/>
+      <w:lvlJc w:val="left"/>
+      <w:pPr>
+        <w:tabs>
+          <w:tab w:val="num" w:pos="5760"/>
+        </w:tabs>
+        <w:ind w:left="5760" w:hanging="360"/>
+      </w:pPr>
+    </w:lvl>
+    <w:lvl w:ilvl="8" w:tentative="1">
+      <w:start w:val="1"/>
+      <w:numFmt w:val="decimal"/>
+      <w:lvlText w:val="%9."/>
+      <w:lvlJc w:val="left"/>
+      <w:pPr>
+        <w:tabs>
+          <w:tab w:val="num" w:pos="6480"/>
+        </w:tabs>
+        <w:ind w:left="6480" w:hanging="360"/>
       </w:pPr>
     </w:lvl>
   </w:abstractNum>
@@ -1918,6 +4203,9 @@
     <w:lvlOverride w:ilvl="0">
       <w:startOverride w:val="1"/>
     </w:lvlOverride>
+  </w:num>
+  <w:num w:numId="14" w16cid:durableId="1341009462">
+    <w:abstractNumId w:val="8"/>
   </w:num>
   <w:numIdMacAtCleanup w:val="1"/>
 </w:numbering>
@@ -2409,7 +4697,6 @@
   <w:style w:type="character" w:default="1" w:styleId="a1">
     <w:name w:val="Default Paragraph Font"/>
     <w:uiPriority w:val="1"/>
-    <w:semiHidden/>
     <w:unhideWhenUsed/>
   </w:style>
   <w:style w:type="table" w:default="1" w:styleId="a2">

</xml_diff>